<commit_message>
JMEP R1 rebuilt on the July text (Song's advice): only reviewer-driven changes and corrections; fact-checked; marked-up vs July, trimmed ESM2, letter and ledger rewritten
</commit_message>
<xml_diff>
--- a/submissions/JMEP-R1/Response-to-reviewers.docx
+++ b/submissions/JMEP-R1/Response-to-reviewers.docx
@@ -19,7 +19,7 @@
           <w:b/>
           <w:bCs/>
         </w:rPr>
-        <w:t xml:space="preserve">DRAFT 2026-10-12.</w:t>
+        <w:t xml:space="preserve">DRAFT 2026-10-14 (rebuilt on the July text).</w:t>
       </w:r>
       <w:r>
         <w:t xml:space="preserve"> </w:t>
@@ -89,7 +89,7 @@
         <w:pStyle w:val="BodyText"/>
       </w:pPr>
       <w:r>
-        <w:t xml:space="preserve">Thank you for the opportunity to revise our manuscript, and thank you to both reviewers for detailed and constructive reports. We have revised the manuscript throughout. Every comment is answered below, in order, with the location of the corresponding change in the revised manuscript.</w:t>
+        <w:t xml:space="preserve">Thank you for the opportunity to revise our manuscript, and thank you to both reviewers for detailed and constructive reports. Every comment is answered below, in order, with the location of the corresponding change in the revised manuscript. The revision keeps the structure of the original submission and changes it only where a comment asked for it or where we found an error.</w:t>
       </w:r>
     </w:p>
     <w:bookmarkStart w:id="9" w:name="summary-of-the-revision"/>
@@ -106,7 +106,7 @@
         <w:pStyle w:val="FirstParagraph"/>
       </w:pPr>
       <w:r>
-        <w:t xml:space="preserve">Reviewer 2 asked for fuller reporting of the work already performed, a transparent statement of the study’s scope, reanalysis of available data where practical, and conclusions limited to the evidence. We have done all four. Since the original submission we have also completed work that bears directly on several comments:</w:t>
+        <w:t xml:space="preserve">Reviewer 2 asked for fuller reporting of the work already performed, a transparent statement of the study’s scope, reanalysis of available data where practical, and conclusions limited to the evidence. We have done all four. Three additions bear on several comments at once:</w:t>
       </w:r>
     </w:p>
     <w:p>
@@ -144,35 +144,10 @@
           <w:b/>
           <w:bCs/>
         </w:rPr>
-        <w:t xml:space="preserve">Equilibrium calculations on the measured chemistry.</w:t>
-      </w:r>
-      <w:r>
-        <w:t xml:space="preserve"> </w:t>
-      </w:r>
-      <w:r>
-        <w:t xml:space="preserve">CALPHAD step diagrams in three independent open databases, a virtual carbon-free control, a nickel scan, and compositions inside the LLM’s proposed window (new Sections 2.6 and 3.4, Tables 3 and 4, Fig. 9). Reviewer 2 (comment 5a) suggested this.</w:t>
-      </w:r>
-    </w:p>
-    <w:p>
-      <w:pPr>
-        <w:pStyle w:val="Compact"/>
-        <w:numPr>
-          <w:ilvl w:val="0"/>
-          <w:numId w:val="1001"/>
-        </w:numPr>
-      </w:pPr>
-      <w:r>
-        <w:rPr>
-          <w:b/>
-          <w:bCs/>
-        </w:rPr>
-        <w:t xml:space="preserve">Figures re-derived from the raw data.</w:t>
-      </w:r>
-      <w:r>
-        <w:t xml:space="preserve"> </w:t>
-      </w:r>
-      <w:r>
-        <w:t xml:space="preserve">Fig. 2 from the raw tensile exports; Figs. 4, 6 and 8 from the raw synchrotron detector frames.</w:t>
+        <w:t xml:space="preserve">Equilibrium calculations on the measured chemistry</w:t>
+      </w:r>
+      <w:r>
+        <w:t xml:space="preserve">, which Reviewer 2 suggested (comment 5a): CALPHAD calculations in three independent open databases, including a calculated carbon-free control (new Sections 2.6 and 3.4, Table 3).</w:t>
       </w:r>
     </w:p>
     <w:p>
@@ -194,26 +169,7 @@
         <w:t xml:space="preserve"> </w:t>
       </w:r>
       <w:r>
-        <w:t xml:space="preserve">(Online Resource 1), and a register of every specimen and calculation behind the figures and tables (Online Resource 2, Tables S1 and S2).</w:t>
-      </w:r>
-    </w:p>
-    <w:p>
-      <w:pPr>
-        <w:pStyle w:val="Compact"/>
-        <w:numPr>
-          <w:ilvl w:val="0"/>
-          <w:numId w:val="1001"/>
-        </w:numPr>
-      </w:pPr>
-      <w:r>
-        <w:rPr>
-          <w:b/>
-          <w:bCs/>
-        </w:rPr>
-        <w:t xml:space="preserve">The cyclic abnormal-grain-growth treatments</w:t>
-      </w:r>
-      <w:r>
-        <w:t xml:space="preserve">, now reported with their microstructure and tensile records (new Section 3.5, Fig. 1d, Fig. 10), and the drawing texture (Fig. 7) and the treated rod’s diffraction (Fig. 8).</w:t>
+        <w:t xml:space="preserve">(Online Resource 1), and a register of every specimen and calculation behind the figures, tables and text (Online Resource 2, Tables S1 and S2).</w:t>
       </w:r>
     </w:p>
     <w:p>
@@ -239,15 +195,91 @@
         <w:pStyle w:val="BodyText"/>
       </w:pPr>
       <w:r>
-        <w:t xml:space="preserve">Three errors in the original text are corrected: the gauge length was 127 mm, not 13 mm (a typographical error; the instrument records give 5.000 in); the α fraction is 34% (with 4% D0₃), not 37%; and the model was prompted, not trained.</w:t>
-      </w:r>
-    </w:p>
-    <w:p>
-      <w:pPr>
-        <w:pStyle w:val="BodyText"/>
-      </w:pPr>
-      <w:r>
-        <w:t xml:space="preserve">Because most of the text has been rewritten, the marked-up manuscript shows the changes as tracked changes against the original submission.</w:t>
+        <w:t xml:space="preserve">The following errors in the original text are corrected:</w:t>
+      </w:r>
+    </w:p>
+    <w:p>
+      <w:pPr>
+        <w:pStyle w:val="Compact"/>
+        <w:numPr>
+          <w:ilvl w:val="0"/>
+          <w:numId w:val="1002"/>
+        </w:numPr>
+      </w:pPr>
+      <w:r>
+        <w:t xml:space="preserve">The gauge length was 127 mm, not 13 mm (a typographical error; the instrument records give 5.000 in), and the nominal strain rate is 8.3 × 10⁻⁴ s⁻¹ (0.25 in min⁻¹ over 127 mm), not 1 × 10⁻³ s⁻¹.</w:t>
+      </w:r>
+    </w:p>
+    <w:p>
+      <w:pPr>
+        <w:pStyle w:val="Compact"/>
+        <w:numPr>
+          <w:ilvl w:val="0"/>
+          <w:numId w:val="1002"/>
+        </w:numPr>
+      </w:pPr>
+      <w:r>
+        <w:t xml:space="preserve">The α fraction is 34% (with 4% D0₃), not 37%.</w:t>
+      </w:r>
+    </w:p>
+    <w:p>
+      <w:pPr>
+        <w:pStyle w:val="Compact"/>
+        <w:numPr>
+          <w:ilvl w:val="0"/>
+          <w:numId w:val="1002"/>
+        </w:numPr>
+      </w:pPr>
+      <w:r>
+        <w:t xml:space="preserve">The model was prompted, not trained.</w:t>
+      </w:r>
+    </w:p>
+    <w:p>
+      <w:pPr>
+        <w:pStyle w:val="Compact"/>
+        <w:numPr>
+          <w:ilvl w:val="0"/>
+          <w:numId w:val="1002"/>
+        </w:numPr>
+      </w:pPr>
+      <w:r>
+        <w:t xml:space="preserve">The melted composition lies outside the proposed range in Mn and Al, not within it (Section 2.1).</w:t>
+      </w:r>
+    </w:p>
+    <w:p>
+      <w:pPr>
+        <w:pStyle w:val="Compact"/>
+        <w:numPr>
+          <w:ilvl w:val="0"/>
+          <w:numId w:val="1002"/>
+        </w:numPr>
+      </w:pPr>
+      <w:r>
+        <w:t xml:space="preserve">The Omori-alloy wire was 0.64 mm in diameter, not 0.36 mm.</w:t>
+      </w:r>
+    </w:p>
+    <w:p>
+      <w:pPr>
+        <w:pStyle w:val="Compact"/>
+        <w:numPr>
+          <w:ilvl w:val="0"/>
+          <w:numId w:val="1002"/>
+        </w:numPr>
+      </w:pPr>
+      <w:r>
+        <w:t xml:space="preserve">The cyclic abnormal-grain-growth schedule was applied to ≈1–1.3 mm rod, and a separate cyclic treatment to 0.36 mm wire (Section 2.2), not as one schedule to wire.</w:t>
+      </w:r>
+    </w:p>
+    <w:p>
+      <w:pPr>
+        <w:pStyle w:val="Compact"/>
+        <w:numPr>
+          <w:ilvl w:val="0"/>
+          <w:numId w:val="1002"/>
+        </w:numPr>
+      </w:pPr>
+      <w:r>
+        <w:t xml:space="preserve">The single panel of the original Fig. 5 showed the refinement of the specimen unloaded from 10% strain, not of the heat-treated specimen as captioned. Fig. 5 now shows both refinements, each labelled, with its fit indices.</w:t>
       </w:r>
       <w:r>
         <w:t xml:space="preserve"> </w:t>
@@ -257,13 +289,91 @@
           <w:b/>
           <w:bCs/>
         </w:rPr>
-        <w:t xml:space="preserve">[OPEN — FC: confirm the highlighting method. A Word comparison against the July file will mark nearly every paragraph; the alternative the letter allows is colored text for new material.]</w:t>
-      </w:r>
-      <w:r>
-        <w:t xml:space="preserve"> </w:t>
-      </w:r>
-      <w:r>
-        <w:t xml:space="preserve">The section map below gives the correspondence.</w:t>
+        <w:t xml:space="preserve">[OPEN — SC/FC: confirm; S. Cai’s two-panel figure places the original panel as the deformed specimen, while his note of 2026-08-08 called it the heat-treated one.]</w:t>
+      </w:r>
+    </w:p>
+    <w:p>
+      <w:pPr>
+        <w:pStyle w:val="Compact"/>
+        <w:numPr>
+          <w:ilvl w:val="0"/>
+          <w:numId w:val="1002"/>
+        </w:numPr>
+      </w:pPr>
+      <w:r>
+        <w:t xml:space="preserve">In the original Fig. 6a the 0%-strain spectrum was displaced upward by about 100 counts without this being stated. Fig. 6 is now replotted from the integrated data without offset, with the same labels; the normalization of Fig. 6b is stated in the caption.</w:t>
+      </w:r>
+    </w:p>
+    <w:p>
+      <w:pPr>
+        <w:pStyle w:val="Compact"/>
+        <w:numPr>
+          <w:ilvl w:val="0"/>
+          <w:numId w:val="1002"/>
+        </w:numPr>
+      </w:pPr>
+      <w:r>
+        <w:t xml:space="preserve">The description of the request put to the agent now states only what its surviving report records (Section 2.1).</w:t>
+      </w:r>
+    </w:p>
+    <w:p>
+      <w:pPr>
+        <w:pStyle w:val="Compact"/>
+        <w:numPr>
+          <w:ilvl w:val="0"/>
+          <w:numId w:val="1002"/>
+        </w:numPr>
+      </w:pPr>
+      <w:r>
+        <w:t xml:space="preserve">The declarations now disclose S. Cai’s employment by Fort Wayne Metals, and the use of Anthropic Claude in writing and editing the revised text.</w:t>
+      </w:r>
+      <w:r>
+        <w:t xml:space="preserve"> </w:t>
+      </w:r>
+      <w:r>
+        <w:rPr>
+          <w:b/>
+          <w:bCs/>
+        </w:rPr>
+        <w:t xml:space="preserve">[OPEN — FC: confirm the AI-use statement, and whether the original statement (</w:t>
+      </w:r>
+      <w:r>
+        <w:rPr>
+          <w:b/>
+          <w:bCs/>
+        </w:rPr>
+        <w:t xml:space="preserve">“no generative AI tools were used to draft, edit, or otherwise prepare the text”</w:t>
+      </w:r>
+      <w:r>
+        <w:rPr>
+          <w:b/>
+          <w:bCs/>
+        </w:rPr>
+        <w:t xml:space="preserve">) was accurate for the July text; if not, say so here.]</w:t>
+      </w:r>
+    </w:p>
+    <w:p>
+      <w:pPr>
+        <w:pStyle w:val="FirstParagraph"/>
+      </w:pPr>
+      <w:r>
+        <w:t xml:space="preserve">All changes are shown as tracked changes against the original submission in the marked-up manuscript.</w:t>
+      </w:r>
+      <w:r>
+        <w:t xml:space="preserve"> </w:t>
+      </w:r>
+      <w:r>
+        <w:rPr>
+          <w:b/>
+          <w:bCs/>
+        </w:rPr>
+        <w:t xml:space="preserve">[OPEN — FC: confirm tracked changes as the highlighting method (recommended; the file is built).]</w:t>
+      </w:r>
+      <w:r>
+        <w:t xml:space="preserve"> </w:t>
+      </w:r>
+      <w:r>
+        <w:t xml:space="preserve">Section numbering is unchanged except for the additions below.</w:t>
       </w:r>
     </w:p>
     <w:tbl>
@@ -312,31 +422,7 @@
               <w:pStyle w:val="Compact"/>
             </w:pPr>
             <w:r>
-              <w:t xml:space="preserve">1 Introduction</w:t>
-            </w:r>
-          </w:p>
-        </w:tc>
-        <w:tc>
-          <w:tcPr/>
-          <w:p>
-            <w:pPr>
-              <w:pStyle w:val="Compact"/>
-            </w:pPr>
-            <w:r>
-              <w:t xml:space="preserve">1 Introduction (revised)</w:t>
-            </w:r>
-          </w:p>
-        </w:tc>
-      </w:tr>
-      <w:tr>
-        <w:tc>
-          <w:tcPr/>
-          <w:p>
-            <w:pPr>
-              <w:pStyle w:val="Compact"/>
-            </w:pPr>
-            <w:r>
-              <w:t xml:space="preserve">2.1–2.5 Materials and experiments</w:t>
+              <w:t xml:space="preserve">2.1–2.5</w:t>
             </w:r>
           </w:p>
         </w:tc>
@@ -394,7 +480,7 @@
               <w:pStyle w:val="Compact"/>
             </w:pPr>
             <w:r>
-              <w:t xml:space="preserve">3.2 Cyclic stress–strain response (Fig. 2, 3; Table 2)</w:t>
+              <w:t xml:space="preserve">3.2, 3.3 (Figs. 2–6; Tables 1, 2)</w:t>
             </w:r>
           </w:p>
         </w:tc>
@@ -405,31 +491,7 @@
               <w:pStyle w:val="Compact"/>
             </w:pPr>
             <w:r>
-              <w:t xml:space="preserve">3.2 (Table 2 now n = 3)</w:t>
-            </w:r>
-          </w:p>
-        </w:tc>
-      </w:tr>
-      <w:tr>
-        <w:tc>
-          <w:tcPr/>
-          <w:p>
-            <w:pPr>
-              <w:pStyle w:val="Compact"/>
-            </w:pPr>
-            <w:r>
-              <w:t xml:space="preserve">3.3 Synchrotron diffraction (Figs. 4–6)</w:t>
-            </w:r>
-          </w:p>
-        </w:tc>
-        <w:tc>
-          <w:tcPr/>
-          <w:p>
-            <w:pPr>
-              <w:pStyle w:val="Compact"/>
-            </w:pPr>
-            <w:r>
-              <w:t xml:space="preserve">3.3 (Figs. 4–6 re-derived; Figs. 7, 8 new)</w:t>
+              <w:t xml:space="preserve">3.2, 3.3 (Table 1 now wt% and at%; Table 2 now n = 3; Fig. 5 now two panels; Fig. 6 replotted without offset)</w:t>
             </w:r>
           </w:p>
         </w:tc>
@@ -457,7 +519,7 @@
                 <w:b/>
                 <w:bCs/>
               </w:rPr>
-              <w:t xml:space="preserve">3.4 Equilibrium phase stability (new; Fig. 9, Tables 3, 4)</w:t>
+              <w:t xml:space="preserve">3.4 Equilibrium phase stability (new; Table 3)</w:t>
             </w:r>
           </w:p>
         </w:tc>
@@ -470,35 +532,7 @@
               <w:pStyle w:val="Compact"/>
             </w:pPr>
             <w:r>
-              <w:t xml:space="preserve">—</w:t>
-            </w:r>
-          </w:p>
-        </w:tc>
-        <w:tc>
-          <w:tcPr/>
-          <w:p>
-            <w:pPr>
-              <w:pStyle w:val="Compact"/>
-            </w:pPr>
-            <w:r>
-              <w:rPr>
-                <w:b/>
-                <w:bCs/>
-              </w:rPr>
-              <w:t xml:space="preserve">3.5 Response to the abnormal-grain-growth treatment (new; Fig. 10)</w:t>
-            </w:r>
-          </w:p>
-        </w:tc>
-      </w:tr>
-      <w:tr>
-        <w:tc>
-          <w:tcPr/>
-          <w:p>
-            <w:pPr>
-              <w:pStyle w:val="Compact"/>
-            </w:pPr>
-            <w:r>
-              <w:t xml:space="preserve">4.1 Origin of the absence of transformation</w:t>
+              <w:t xml:space="preserve">4.1 Origin of the absence of stress-induced phase transformation</w:t>
             </w:r>
           </w:p>
         </w:tc>
@@ -522,7 +556,7 @@
               <w:pStyle w:val="Compact"/>
             </w:pPr>
             <w:r>
-              <w:t xml:space="preserve">—</w:t>
+              <w:t xml:space="preserve">4.2, 4.3</w:t>
             </w:r>
           </w:p>
         </w:tc>
@@ -533,59 +567,7 @@
               <w:pStyle w:val="Compact"/>
             </w:pPr>
             <w:r>
-              <w:rPr>
-                <w:b/>
-                <w:bCs/>
-              </w:rPr>
-              <w:t xml:space="preserve">4.2 The role of carbon (new)</w:t>
-            </w:r>
-          </w:p>
-        </w:tc>
-      </w:tr>
-      <w:tr>
-        <w:tc>
-          <w:tcPr/>
-          <w:p>
-            <w:pPr>
-              <w:pStyle w:val="Compact"/>
-            </w:pPr>
-            <w:r>
-              <w:t xml:space="preserve">4.2 Anneal-temperature dependence</w:t>
-            </w:r>
-          </w:p>
-        </w:tc>
-        <w:tc>
-          <w:tcPr/>
-          <w:p>
-            <w:pPr>
-              <w:pStyle w:val="Compact"/>
-            </w:pPr>
-            <w:r>
-              <w:t xml:space="preserve">4.3</w:t>
-            </w:r>
-          </w:p>
-        </w:tc>
-      </w:tr>
-      <w:tr>
-        <w:tc>
-          <w:tcPr/>
-          <w:p>
-            <w:pPr>
-              <w:pStyle w:val="Compact"/>
-            </w:pPr>
-            <w:r>
-              <w:t xml:space="preserve">4.3 Implications for AI-guided alloy design</w:t>
-            </w:r>
-          </w:p>
-        </w:tc>
-        <w:tc>
-          <w:tcPr/>
-          <w:p>
-            <w:pPr>
-              <w:pStyle w:val="Compact"/>
-            </w:pPr>
-            <w:r>
-              <w:t xml:space="preserve">4.4</w:t>
+              <w:t xml:space="preserve">4.2, 4.3 (4.3 rewritten, comment 18)</w:t>
             </w:r>
           </w:p>
         </w:tc>
@@ -609,7 +591,7 @@
               <w:pStyle w:val="Compact"/>
             </w:pPr>
             <w:r>
-              <w:t xml:space="preserve">5 Conclusions (restructured: measured / interpreted / calculated / open)</w:t>
+              <w:t xml:space="preserve">5 Conclusions (rewritten, comments 1b and 18d)</w:t>
             </w:r>
           </w:p>
         </w:tc>
@@ -658,7 +640,7 @@
           <w:b/>
           <w:bCs/>
         </w:rPr>
-        <w:t xml:space="preserve">[OPEN — FC: if X. Wang is added, state it here with his contribution and attach the journal’s authorship-change form. The Katona draft asks what the journal needs.]</w:t>
+        <w:t xml:space="preserve">[OPEN — FC: if X. Wang is added (he supervised the work throughout, per the Author contributions statement), state it here and attach the journal’s authorship-change form. The Katona draft asks what the journal needs.]</w:t>
       </w:r>
     </w:p>
     <w:bookmarkEnd w:id="9"/>
@@ -684,7 +666,7 @@
         <w:pStyle w:val="FirstParagraph"/>
       </w:pPr>
       <w:r>
-        <w:t xml:space="preserve">Thank you. All changes are highlighted in the marked-up manuscript as described above, and this document is the separate response.</w:t>
+        <w:t xml:space="preserve">Thank you. All changes are shown as tracked changes in the marked-up manuscript, and this document is the separate response.</w:t>
       </w:r>
     </w:p>
     <w:p>
@@ -728,13 +710,7 @@
         <w:t xml:space="preserve"> </w:t>
       </w:r>
       <w:r>
-        <w:t xml:space="preserve">“The manuscript has been rewritten throughout and checked for grammar and clarity by the authors; we would be glad to use a professional service at the production stage if the editors judge it still necessary.”</w:t>
-      </w:r>
-      <w:r>
-        <w:t xml:space="preserve"> </w:t>
-      </w:r>
-      <w:r>
-        <w:t xml:space="preserve">(The Generative-AI declaration already discloses writing assistance.)</w:t>
+        <w:t xml:space="preserve">“The manuscript has been revised throughout and checked for grammar and clarity by the authors; we would be glad to use a professional service at the production stage if the editors judge it still necessary.”</w:t>
       </w:r>
     </w:p>
     <w:bookmarkEnd w:id="10"/>
@@ -760,7 +736,7 @@
         <w:pStyle w:val="FirstParagraph"/>
       </w:pPr>
       <w:r>
-        <w:t xml:space="preserve">Done. The keywords are now: alloy design; CALPHAD; Fe-based shape memory alloy; large language model; phase stability; superelasticity; synchrotron XRD.</w:t>
+        <w:t xml:space="preserve">Done. The keywords are now: abnormal grain growth; alloy design; CALPHAD; Fe-based shape memory alloy; large language model; superelasticity; synchrotron XRD.</w:t>
       </w:r>
     </w:p>
     <w:p>
@@ -776,7 +752,7 @@
         <w:pStyle w:val="FirstParagraph"/>
       </w:pPr>
       <w:r>
-        <w:t xml:space="preserve">We agree that this cannot be excluded experimentally, and the revised manuscript says so. It addresses the question in three ways.</w:t>
+        <w:t xml:space="preserve">We agree that this cannot be excluded, and the revised manuscript says so (Section 4.1, first paragraph). We no longer claim that a common route isolates composition: identical nominal processing does not guarantee identical recrystallization, grain size, texture or precipitation in two compositions (Section 1).</w:t>
       </w:r>
     </w:p>
     <w:p>
@@ -784,7 +760,7 @@
         <w:pStyle w:val="BodyText"/>
       </w:pPr>
       <w:r>
-        <w:t xml:space="preserve">First, we no longer claim that a common route isolates composition. Identical nominal processing does not guarantee identical recrystallization, grain size, texture or precipitation in two compositions (Section 1, Section 4.1).</w:t>
+        <w:t xml:space="preserve">Two observations bound the possibility without removing it. First, the LLM alloy was given a wider range of treatments than the Omori alloy, including the 200 °C/3 h age reported to develop pseudoelasticity in this family, which the Omori specimen of Fig. 3b did not receive; none produced strain recovery (next comment). Second, the new equilibrium calculations show that the processing question has a compositional root. The Omori alloy’s route depends on solution treatment in a single-phase α field. In all three thermodynamic databases, the LLM alloy has no single-phase α field at any temperature in the solid state: it is still α + γ when it begins to melt (Section 3.4, Table 3). No choice of solution temperature can therefore reproduce the Omori alloy’s starting state.</w:t>
       </w:r>
     </w:p>
     <w:p>
@@ -792,7 +768,107 @@
         <w:pStyle w:val="BodyText"/>
       </w:pPr>
       <w:r>
-        <w:t xml:space="preserve">Second, the LLM-alloy was given a wider range of treatments than the benchmark, and none produced strain recovery (next comment).</w:t>
+        <w:t xml:space="preserve">A solution-and-aging window optimized for this composition remains untested; Section 4.3 names it as open, and the Conclusions are worded so that they remain valid if such a route is later found.</w:t>
+      </w:r>
+    </w:p>
+    <w:p>
+      <w:pPr>
+        <w:pStyle w:val="BlockText"/>
+      </w:pPr>
+      <w:r>
+        <w:t xml:space="preserve">Were alternative processing steps tried in order to possibly obtain the shape memory effect?</w:t>
+      </w:r>
+    </w:p>
+    <w:p>
+      <w:pPr>
+        <w:pStyle w:val="FirstParagraph"/>
+      </w:pPr>
+      <w:r>
+        <w:t xml:space="preserve">Yes. They are now stated in Section 2.2 and their results in Section 3.2 (last paragraph) and Fig. 1d:</w:t>
+      </w:r>
+    </w:p>
+    <w:p>
+      <w:pPr>
+        <w:pStyle w:val="Compact"/>
+        <w:numPr>
+          <w:ilvl w:val="0"/>
+          <w:numId w:val="1003"/>
+        </w:numPr>
+      </w:pPr>
+      <w:r>
+        <w:t xml:space="preserve">1-minute strand anneals at seven temperatures, 600–1200 °C (Fig. 2, Table 2);</w:t>
+      </w:r>
+    </w:p>
+    <w:p>
+      <w:pPr>
+        <w:pStyle w:val="Compact"/>
+        <w:numPr>
+          <w:ilvl w:val="0"/>
+          <w:numId w:val="1003"/>
+        </w:numPr>
+      </w:pPr>
+      <w:r>
+        <w:t xml:space="preserve">the 200 °C/3 h age reported to develop pseudoelasticity in this family (Fig. 2f);</w:t>
+      </w:r>
+    </w:p>
+    <w:p>
+      <w:pPr>
+        <w:pStyle w:val="Compact"/>
+        <w:numPr>
+          <w:ilvl w:val="0"/>
+          <w:numId w:val="1003"/>
+        </w:numPr>
+      </w:pPr>
+      <w:r>
+        <w:t xml:space="preserve">static holds at 1200 °C for 40 and 80 minutes (Fig. 1c);</w:t>
+      </w:r>
+    </w:p>
+    <w:p>
+      <w:pPr>
+        <w:pStyle w:val="Compact"/>
+        <w:numPr>
+          <w:ilvl w:val="0"/>
+          <w:numId w:val="1003"/>
+        </w:numPr>
+      </w:pPr>
+      <w:r>
+        <w:t xml:space="preserve">cyclic abnormal-grain-growth treatments: two- and three-cycle 1200 ↔ 900 °C schedules on ≈1–1.3 mm rod, and a four-hold 1200 °C quartz-tube schedule on 0.36 mm wire (Fig. 1d);</w:t>
+      </w:r>
+    </w:p>
+    <w:p>
+      <w:pPr>
+        <w:pStyle w:val="Compact"/>
+        <w:numPr>
+          <w:ilvl w:val="0"/>
+          <w:numId w:val="1003"/>
+        </w:numPr>
+      </w:pPr>
+      <w:r>
+        <w:t xml:space="preserve">exposures at 1250 and 1300 °C, which caused severe oxidation and are not reported further.</w:t>
+      </w:r>
+    </w:p>
+    <w:p>
+      <w:pPr>
+        <w:pStyle w:val="FirstParagraph"/>
+      </w:pPr>
+      <w:r>
+        <w:t xml:space="preserve">No condition showed a transformation plateau or strain recovery beyond elastic springback on unloading (the unrecrystallized as-drawn and 600 °C wire shows a small non-linearity, at most ≈0.3%, which Section 3.2 reports), and the 1200 °C/1 min condition showed none on heating. The cyclically treated wire did not develop a bamboo structure (Fig. 1d), and the coarsened conditions were brittle, failing at 0.5–1.0% elongation (Section 3.2).</w:t>
+      </w:r>
+    </w:p>
+    <w:p>
+      <w:pPr>
+        <w:pStyle w:val="BlockText"/>
+      </w:pPr>
+      <w:r>
+        <w:t xml:space="preserve">The AI developed alloy contains additional Si and C as compared to the Omori alloy. Where does this added Si and C appear? In the matrix or in some phases? Or someplace else?</w:t>
+      </w:r>
+    </w:p>
+    <w:p>
+      <w:pPr>
+        <w:pStyle w:val="FirstParagraph"/>
+      </w:pPr>
+      <w:r>
+        <w:t xml:space="preserve">This was not measured directly. EDS cannot quantify carbon and was used qualitatively. We have therefore added the calculated partitioning at the 1200 °C solution-treatment temperature, from the same three databases (Section 3.4). No carbide is stable at that temperature, so both elements are calculated to be in solid solution, and both concentrate in γ: carbon strongly (1.0–1.3 at% in γ against ≈0.1 at% in α, in all three databases) and silicon mildly (2.6–2.7 against 1.7–1.8 at%, in the two databases that carry silicon). The same calculation places aluminum in α and manganese in γ, which is the direction of the EDS contrast in Fig. 1b.</w:t>
       </w:r>
     </w:p>
     <w:p>
@@ -800,123 +876,7 @@
         <w:pStyle w:val="BodyText"/>
       </w:pPr>
       <w:r>
-        <w:t xml:space="preserve">Third, the new equilibrium calculations show that the processing question has a compositional root. The benchmark’s route depends on solution treatment in a single-phase α field. In all three thermodynamic databases, the LLM-alloy has no single-phase α field at any temperature in the solid state: it is still α + γ when it begins to melt (Section 3.4, Tables 3 and 4). No choice of solution temperature can therefore reproduce the benchmark’s starting state. Removing the alloy’s 0.10 wt% carbon in the calculation restores that field (Section 4.2).</w:t>
-      </w:r>
-    </w:p>
-    <w:p>
-      <w:pPr>
-        <w:pStyle w:val="BodyText"/>
-      </w:pPr>
-      <w:r>
-        <w:t xml:space="preserve">What remains untested is a solution-and-aging window optimized for this composition rather than inherited from the benchmark; Section 4.4 names it as open, and the Conclusions are worded so that they remain valid if such a route is later found.</w:t>
-      </w:r>
-    </w:p>
-    <w:p>
-      <w:pPr>
-        <w:pStyle w:val="BlockText"/>
-      </w:pPr>
-      <w:r>
-        <w:t xml:space="preserve">Were alternative processing steps tried in order to possibly obtain the shape memory effect?</w:t>
-      </w:r>
-    </w:p>
-    <w:p>
-      <w:pPr>
-        <w:pStyle w:val="FirstParagraph"/>
-      </w:pPr>
-      <w:r>
-        <w:t xml:space="preserve">Yes. They are now listed in Section 2.2 and reported in Sections 3.2 and 3.5:</w:t>
-      </w:r>
-    </w:p>
-    <w:p>
-      <w:pPr>
-        <w:pStyle w:val="Compact"/>
-        <w:numPr>
-          <w:ilvl w:val="0"/>
-          <w:numId w:val="1002"/>
-        </w:numPr>
-      </w:pPr>
-      <w:r>
-        <w:t xml:space="preserve">1-minute strand anneals at seven temperatures, 600–1200 °C (Fig. 2, Table 2);</w:t>
-      </w:r>
-    </w:p>
-    <w:p>
-      <w:pPr>
-        <w:pStyle w:val="Compact"/>
-        <w:numPr>
-          <w:ilvl w:val="0"/>
-          <w:numId w:val="1002"/>
-        </w:numPr>
-      </w:pPr>
-      <w:r>
-        <w:t xml:space="preserve">the 200 °C/3 h age reported to develop pseudoelasticity in this family (Fig. 2h);</w:t>
-      </w:r>
-    </w:p>
-    <w:p>
-      <w:pPr>
-        <w:pStyle w:val="Compact"/>
-        <w:numPr>
-          <w:ilvl w:val="0"/>
-          <w:numId w:val="1002"/>
-        </w:numPr>
-      </w:pPr>
-      <w:r>
-        <w:t xml:space="preserve">prolonged holds at 1200 °C for 40 and 80 minutes (Fig. 1c, Fig. 10a, b);</w:t>
-      </w:r>
-    </w:p>
-    <w:p>
-      <w:pPr>
-        <w:pStyle w:val="Compact"/>
-        <w:numPr>
-          <w:ilvl w:val="0"/>
-          <w:numId w:val="1002"/>
-        </w:numPr>
-      </w:pPr>
-      <w:r>
-        <w:t xml:space="preserve">three cyclic abnormal-grain-growth schedules: two- and three-cycle 1200 ↔ 900 °C schedules on rod, and a four-cycle 1200 °C quartz-tube schedule on wire (Fig. 1d, Figs. 8 and 10);</w:t>
-      </w:r>
-    </w:p>
-    <w:p>
-      <w:pPr>
-        <w:pStyle w:val="Compact"/>
-        <w:numPr>
-          <w:ilvl w:val="0"/>
-          <w:numId w:val="1002"/>
-        </w:numPr>
-      </w:pPr>
-      <w:r>
-        <w:t xml:space="preserve">exposures at 1250 and 1300 °C, which caused severe oxidation and are not reported further.</w:t>
-      </w:r>
-    </w:p>
-    <w:p>
-      <w:pPr>
-        <w:pStyle w:val="FirstParagraph"/>
-      </w:pPr>
-      <w:r>
-        <w:t xml:space="preserve">No condition showed strain recovery beyond elastic springback on unloading, and the 1200 °C/1 min condition showed none on heating. The cyclic treatments coarsened the rod but did not produce a bamboo structure, and the coarsened conditions were brittle (Section 3.5).</w:t>
-      </w:r>
-    </w:p>
-    <w:p>
-      <w:pPr>
-        <w:pStyle w:val="BlockText"/>
-      </w:pPr>
-      <w:r>
-        <w:t xml:space="preserve">The AI developed alloy contains additional Si and C as compared to the Omori alloy. Where does this added Si and C appear? In the matrix or in some phases? Or someplace else?</w:t>
-      </w:r>
-    </w:p>
-    <w:p>
-      <w:pPr>
-        <w:pStyle w:val="FirstParagraph"/>
-      </w:pPr>
-      <w:r>
-        <w:t xml:space="preserve">This was not measured directly. EDS cannot quantify carbon and was used qualitatively. We have therefore added the calculated partitioning at the 1200 °C solution-treatment temperature, from the same three databases (Section 3.4). No carbide is stable at that temperature, so both elements are calculated to be in solid solution, and both concentrate in γ: carbon strongly (1.0–1.3 at% in γ against ≈0.1 at% in α, in all three databases) and silicon mildly (2.6–2.7 against 1.7–1.8 at%, in the two databases that carry silicon). The same calculation places aluminum in α and manganese in γ, which is the direction of the EDS contrast in Fig. 1b.</w:t>
-      </w:r>
-    </w:p>
-    <w:p>
-      <w:pPr>
-        <w:pStyle w:val="BodyText"/>
-      </w:pPr>
-      <w:r>
-        <w:t xml:space="preserve">Carbides are calculated to be stable only well below the processing range (κ-carbide below ≈590 °C, M₂₃C₆ below ≈420 °C). None was detected by diffraction or SEM, which would not resolve a fine dispersion, and κ-carbide was not tested in an alternative refinement model, so a small fraction is not excluded (Sections 3.3, 3.4 and 4.2). Silicon may also have contributed to the D0₃ ordering that was observed, as reported for Si-bearing Fe-Mn-Al-C steels; we note this without claiming it (Section 4.2). Note also that only half the intended silicon was recovered in the melt (Table 1).</w:t>
+        <w:t xml:space="preserve">Carbides are calculated to be stable only well below the processing range (κ-carbide below ≈590 °C, M₂₃C₆ below ≈420 °C). None was detected by diffraction or SEM, which would not resolve a fine dispersion, and κ-carbide was not tested in an alternative refinement model, so a small fraction is not excluded (Sections 3.3 and 3.4). Note also that only half the intended silicon was recovered in the melt (Section 2.1, Table 1).</w:t>
       </w:r>
     </w:p>
     <w:p>
@@ -1004,7 +964,7 @@
         <w:pStyle w:val="FirstParagraph"/>
       </w:pPr>
       <w:r>
-        <w:t xml:space="preserve">We thank the reviewer for a careful and constructive report, and for recognizing the value of a documented negative result. We have followed the reviewer’s framing throughout: the revised manuscript treats the work as a single-composition case study, reports the processing and characterization records more fully, separates what was measured from what was calculated, interpreted or left open, and narrows the claims about carbon, transformation, precipitates, diffraction and AI-assisted design.</w:t>
+        <w:t xml:space="preserve">We thank the reviewer for a careful and constructive report, and for recognizing the value of a documented negative result. We have followed the reviewer’s framing throughout: the revised manuscript treats the work as an exploratory case study of one composition, reports the processing and characterization records more fully, separates what was measured from what was calculated, interpreted or left open, and narrows the claims about carbon, transformation, precipitates, diffraction and AI-assisted design.</w:t>
       </w:r>
     </w:p>
     <w:bookmarkStart w:id="12" w:name="title-and-scientific-framing"/>
@@ -1021,7 +981,7 @@
         <w:pStyle w:val="Compact"/>
         <w:numPr>
           <w:ilvl w:val="0"/>
-          <w:numId w:val="1003"/>
+          <w:numId w:val="1004"/>
         </w:numPr>
       </w:pPr>
       <w:r>
@@ -1054,7 +1014,7 @@
         <w:t xml:space="preserve"> </w:t>
       </w:r>
       <w:r>
-        <w:t xml:space="preserve">because the paper treats the composition as a hypothesis under test (Section 1).</w:t>
+        <w:t xml:space="preserve">because the paper treats the composition as a hypothesis under test.</w:t>
       </w:r>
       <w:r>
         <w:t xml:space="preserve"> </w:t>
@@ -1093,7 +1053,7 @@
         <w:pStyle w:val="Compact"/>
         <w:numPr>
           <w:ilvl w:val="0"/>
-          <w:numId w:val="1004"/>
+          <w:numId w:val="1005"/>
         </w:numPr>
       </w:pPr>
       <w:r>
@@ -1105,7 +1065,16 @@
         <w:pStyle w:val="FirstParagraph"/>
       </w:pPr>
       <w:r>
-        <w:t xml:space="preserve">Yes. The Abstract now separates measured, calculated and open results and ends:</w:t>
+        <w:t xml:space="preserve">Yes. The Abstract now separates the three: what the composition did in the conditions tested;</w:t>
+      </w:r>
+      <w:r>
+        <w:t xml:space="preserve"> </w:t>
+      </w:r>
+      <w:r>
+        <w:t xml:space="preserve">“The workflow omitted the phase-stability check its own report recommended”</w:t>
+      </w:r>
+      <w:r>
+        <w:t xml:space="preserve">; and</w:t>
       </w:r>
       <w:r>
         <w:t xml:space="preserve"> </w:t>
@@ -1117,16 +1086,28 @@
         <w:t xml:space="preserve"> </w:t>
       </w:r>
       <w:r>
-        <w:t xml:space="preserve">The Conclusions are organized the same way. The paragraph on the workflow attributes the limitation to</w:t>
-      </w:r>
-      <w:r>
-        <w:t xml:space="preserve"> </w:t>
-      </w:r>
-      <w:r>
-        <w:t xml:space="preserve">“the workflow as it was run … and not a demonstrated limit on what an LLM can propose”</w:t>
-      </w:r>
-      <w:r>
-        <w:t xml:space="preserve">, and the final paragraph states the three limitations, including that one candidate cannot establish how often such workflows fail. Section 4.4 makes the same distinction.</w:t>
+        <w:t xml:space="preserve">The Conclusions take the three in turn: what was observed in the conditions tested (first paragraph); the limitation of</w:t>
+      </w:r>
+      <w:r>
+        <w:t xml:space="preserve"> </w:t>
+      </w:r>
+      <w:r>
+        <w:t xml:space="preserve">“the workflow as it was run, not a demonstrated limit on what an LLM can propose”</w:t>
+      </w:r>
+      <w:r>
+        <w:t xml:space="preserve"> </w:t>
+      </w:r>
+      <w:r>
+        <w:t xml:space="preserve">(third paragraph); and that</w:t>
+      </w:r>
+      <w:r>
+        <w:t xml:space="preserve"> </w:t>
+      </w:r>
+      <w:r>
+        <w:t xml:space="preserve">“this single-composition case study cannot establish how often such workflows fail”</w:t>
+      </w:r>
+      <w:r>
+        <w:t xml:space="preserve">. Section 4.3 makes the same distinction.</w:t>
       </w:r>
     </w:p>
     <w:bookmarkEnd w:id="12"/>
@@ -1144,7 +1125,7 @@
         <w:pStyle w:val="Compact"/>
         <w:numPr>
           <w:ilvl w:val="0"/>
-          <w:numId w:val="1005"/>
+          <w:numId w:val="1006"/>
         </w:numPr>
       </w:pPr>
       <w:r>
@@ -1156,7 +1137,7 @@
         <w:pStyle w:val="FirstParagraph"/>
       </w:pPr>
       <w:r>
-        <w:t xml:space="preserve">We did not train or fine-tune any model. The composition came from one Gemini 2.5 Deep Research session, in which the agent retrieves and reads public sources at query time.</w:t>
+        <w:t xml:space="preserve">We did not train or fine-tune any model. The composition came from a Gemini 2.5 Deep Research session, in which the agent retrieves and reads public sources at query time.</w:t>
       </w:r>
       <w:r>
         <w:t xml:space="preserve"> </w:t>
@@ -1186,7 +1167,7 @@
         <w:pStyle w:val="Compact"/>
         <w:numPr>
           <w:ilvl w:val="0"/>
-          <w:numId w:val="1006"/>
+          <w:numId w:val="1007"/>
         </w:numPr>
       </w:pPr>
       <w:r>
@@ -1221,7 +1202,7 @@
           <w:b/>
           <w:bCs/>
         </w:rPr>
-        <w:t xml:space="preserve">[OPEN — FC: settings available to the user, e.g. </w:t>
+        <w:t xml:space="preserve">[OPEN — FC: confirm the model version (the report itself records no model string), and the settings available to the user, e.g. </w:t>
       </w:r>
       <w:r>
         <w:rPr>
@@ -1241,15 +1222,15 @@
         <w:t xml:space="preserve"> </w:t>
       </w:r>
       <w:r>
-        <w:t xml:space="preserve">The verbatim prompt was not preserved, and the report does not embed it. We state this as a limitation (Sections 2.1 and 5) rather than reconstructing the prompt from memory.</w:t>
-      </w:r>
-    </w:p>
-    <w:p>
-      <w:pPr>
-        <w:pStyle w:val="Compact"/>
-        <w:numPr>
-          <w:ilvl w:val="0"/>
-          <w:numId w:val="1007"/>
+        <w:t xml:space="preserve">The verbatim prompt was not preserved, and the report does not embed it. We state this in Section 2.1 rather than reconstructing the prompt from memory.</w:t>
+      </w:r>
+    </w:p>
+    <w:p>
+      <w:pPr>
+        <w:pStyle w:val="Compact"/>
+        <w:numPr>
+          <w:ilvl w:val="0"/>
+          <w:numId w:val="1008"/>
         </w:numPr>
       </w:pPr>
       <w:r>
@@ -1325,7 +1306,7 @@
         <w:pStyle w:val="Compact"/>
         <w:numPr>
           <w:ilvl w:val="0"/>
-          <w:numId w:val="1008"/>
+          <w:numId w:val="1009"/>
         </w:numPr>
       </w:pPr>
       <w:r>
@@ -1337,7 +1318,7 @@
         <w:pStyle w:val="FirstParagraph"/>
       </w:pPr>
       <w:r>
-        <w:t xml:space="preserve">The agent accessed no thermodynamic database or computational tool, and its report contains no calculation. It recommends CALPHAD and DFT as future work, a recommendation now quoted in Section 4.4. The phrase</w:t>
+        <w:t xml:space="preserve">The agent accessed no thermodynamic database or computational tool, and its report contains no calculation; Section 2.1 now says so. The report recommends CALPHAD and DFT as future work, a recommendation quoted in Section 4.3. The phrase</w:t>
       </w:r>
       <w:r>
         <w:t xml:space="preserve"> </w:t>
@@ -1349,7 +1330,7 @@
         <w:t xml:space="preserve"> </w:t>
       </w:r>
       <w:r>
-        <w:t xml:space="preserve">has been removed from Section 1. All CALPHAD calculations in the revised paper were made by the authors, on the measured chemistry, after the experiments (Sections 2.6 and 3.5).</w:t>
+        <w:t xml:space="preserve">has been removed from Section 1. All CALPHAD calculations in the revised paper were made by the authors, on the measured chemistry, after the experiments (Sections 2.6 and 3.4).</w:t>
       </w:r>
     </w:p>
     <w:bookmarkEnd w:id="13"/>
@@ -1367,7 +1348,7 @@
         <w:pStyle w:val="Compact"/>
         <w:numPr>
           <w:ilvl w:val="0"/>
-          <w:numId w:val="1009"/>
+          <w:numId w:val="1010"/>
         </w:numPr>
       </w:pPr>
       <w:r>
@@ -1379,7 +1360,19 @@
         <w:pStyle w:val="FirstParagraph"/>
       </w:pPr>
       <w:r>
-        <w:t xml:space="preserve">The report proposes six candidate families and ranks them; the alloy was drawn from Hypothesis A2, ranked joint second, and the first-ranked candidate was not synthesized (Section 2.1). Section 2.1 also discloses that the composition was chosen by the authors, specified in atomic percent, and lies outside A2’s own range in manganese and aluminum, on the austenite-favoring side. Section 3.4 examines the window itself by calculation.</w:t>
+        <w:t xml:space="preserve">The report proposes six candidate families and ranks them; the alloy was drawn from Hypothesis A2, ranked joint second, and the first-ranked candidate was not synthesized (Section 2.1). Section 2.1 also discloses that the composition was chosen by the authors, specified in atomic percent, and lies outside A2’s own range in manganese and aluminum, on the austenite-favoring side; the original text’s statement that it was chosen</w:t>
+      </w:r>
+      <w:r>
+        <w:t xml:space="preserve"> </w:t>
+      </w:r>
+      <w:r>
+        <w:t xml:space="preserve">“within”</w:t>
+      </w:r>
+      <w:r>
+        <w:t xml:space="preserve"> </w:t>
+      </w:r>
+      <w:r>
+        <w:t xml:space="preserve">the proposed range was incorrect. Section 3.4 examines points inside the range by calculation.</w:t>
       </w:r>
       <w:r>
         <w:t xml:space="preserve"> </w:t>
@@ -1397,7 +1390,7 @@
         <w:pStyle w:val="Compact"/>
         <w:numPr>
           <w:ilvl w:val="0"/>
-          <w:numId w:val="1010"/>
+          <w:numId w:val="1011"/>
         </w:numPr>
       </w:pPr>
       <w:r>
@@ -1419,24 +1412,24 @@
         <w:t xml:space="preserve"> </w:t>
       </w:r>
       <w:r>
-        <w:t xml:space="preserve">If not:</w:t>
-      </w:r>
-      <w:r>
-        <w:t xml:space="preserve"> </w:t>
-      </w:r>
-      <w:r>
-        <w:t xml:space="preserve">“The request was not repeated, and run-to-run variation in the agent’s output is stated as untested (Section 4.4)”</w:t>
-      </w:r>
-      <w:r>
-        <w:t xml:space="preserve">, with the corresponding sentence added to Section 4.4.</w:t>
-      </w:r>
-    </w:p>
-    <w:p>
-      <w:pPr>
-        <w:pStyle w:val="Compact"/>
-        <w:numPr>
-          <w:ilvl w:val="0"/>
-          <w:numId w:val="1011"/>
+        <w:t xml:space="preserve">Section 4.3 now states that</w:t>
+      </w:r>
+      <w:r>
+        <w:t xml:space="preserve"> </w:t>
+      </w:r>
+      <w:r>
+        <w:t xml:space="preserve">“run-to-run variation in the agent’s output was not tested, so nothing here establishes a failure rate”</w:t>
+      </w:r>
+      <w:r>
+        <w:t xml:space="preserve">. If the request was not repeated, Section 2.1 will say so explicitly.</w:t>
+      </w:r>
+    </w:p>
+    <w:p>
+      <w:pPr>
+        <w:pStyle w:val="Compact"/>
+        <w:numPr>
+          <w:ilvl w:val="0"/>
+          <w:numId w:val="1012"/>
         </w:numPr>
       </w:pPr>
       <w:r>
@@ -1460,7 +1453,19 @@
         <w:pStyle w:val="FirstParagraph"/>
       </w:pPr>
       <w:r>
-        <w:t xml:space="preserve">Yes. Section 4.4 now states that one composition from one session, processed by one route,</w:t>
+        <w:t xml:space="preserve">Yes. Section 1 now ends:</w:t>
+      </w:r>
+      <w:r>
+        <w:t xml:space="preserve"> </w:t>
+      </w:r>
+      <w:r>
+        <w:t xml:space="preserve">“The work is an exploratory case study of one LLM-assisted hypothesis, not an evaluation of LLM alloy design as a class.”</w:t>
+      </w:r>
+      <w:r>
+        <w:t xml:space="preserve"> </w:t>
+      </w:r>
+      <w:r>
+        <w:t xml:space="preserve">Section 4.3 states that one composition from one session, processed by one route,</w:t>
       </w:r>
       <w:r>
         <w:t xml:space="preserve"> </w:t>
@@ -1469,7 +1474,7 @@
         <w:t xml:space="preserve">“is a case study of that composition … and still less an evaluation of AI-assisted alloy design as a practice”</w:t>
       </w:r>
       <w:r>
-        <w:t xml:space="preserve">; references to</w:t>
+        <w:t xml:space="preserve">. References to</w:t>
       </w:r>
       <w:r>
         <w:t xml:space="preserve"> </w:t>
@@ -1489,7 +1494,7 @@
         <w:pStyle w:val="Compact"/>
         <w:numPr>
           <w:ilvl w:val="0"/>
-          <w:numId w:val="1012"/>
+          <w:numId w:val="1013"/>
         </w:numPr>
       </w:pPr>
       <w:r>
@@ -1501,7 +1506,7 @@
         <w:pStyle w:val="FirstParagraph"/>
       </w:pPr>
       <w:r>
-        <w:t xml:space="preserve">Section 1 places LLM hypothesis generation beside property-targeted screening and generative inverse design. Section 4.4 now treats screening against the processing window by equilibrium calculation as an established step in conventional alloy design, which the workflow here omitted. It also adds a comparison with domain-trained language models, tool-using LLM agents and closed-loop studies (see 18c).</w:t>
+        <w:t xml:space="preserve">Section 1 places LLM hypothesis generation beside data-driven screening and generative inverse design. Section 4.3 now treats screening against the processing window by equilibrium calculation as the step the workflow omitted, and adds a comparison with domain-trained language models, tool-using LLM agents and closed-loop studies (see 18c).</w:t>
       </w:r>
     </w:p>
     <w:bookmarkEnd w:id="14"/>
@@ -1519,7 +1524,7 @@
         <w:pStyle w:val="Compact"/>
         <w:numPr>
           <w:ilvl w:val="0"/>
-          <w:numId w:val="1013"/>
+          <w:numId w:val="1014"/>
         </w:numPr>
       </w:pPr>
       <w:r>
@@ -1531,15 +1536,15 @@
         <w:pStyle w:val="FirstParagraph"/>
       </w:pPr>
       <w:r>
-        <w:t xml:space="preserve">Done. Table 1 now gives every composition in wt% with at% in parentheses. Its caption states the method (ICP-AES, carbon by ASTM E1019), the sampling (LLM-alloy on the finished wire, benchmark as cast), that each value is a single analysis of one sample per heat, and that no analytical uncertainty is reported. The reviewer’s conversion is correct: the measured LLM-alloy is 51.5Fe-29.8Mn-11.9Al-4.2Ni-2.0Si-0.45C at%. The paper identifies the alloy by this measured composition throughout, and all calculations use it (Section 2.6).</w:t>
-      </w:r>
-    </w:p>
-    <w:p>
-      <w:pPr>
-        <w:pStyle w:val="Compact"/>
-        <w:numPr>
-          <w:ilvl w:val="0"/>
-          <w:numId w:val="1014"/>
+        <w:t xml:space="preserve">Done. Table 1 now gives every composition in wt% with at% in parentheses. Its caption states the method (ICP-AES, carbon by ASTM E1019), the sampling (LLM alloy on the finished wire, Omori alloy as cast), that each value is a single analysis of one sample per heat, and that no analytical uncertainty is reported. The reviewer’s conversion is correct: the measured LLM alloy is 51.5Fe-29.8Mn-11.9Al-4.2Ni-2.0Si-0.45C at%. Section 2.1 identifies the alloy by this measured composition, and all calculations use it (Section 2.6).</w:t>
+      </w:r>
+    </w:p>
+    <w:p>
+      <w:pPr>
+        <w:pStyle w:val="Compact"/>
+        <w:numPr>
+          <w:ilvl w:val="0"/>
+          <w:numId w:val="1015"/>
         </w:numPr>
       </w:pPr>
       <w:r>
@@ -1567,15 +1572,15 @@
         <w:t xml:space="preserve"> </w:t>
       </w:r>
       <w:r>
-        <w:t xml:space="preserve">Its effect on phase stability was evaluated by calculation. The nominal composition, with its intended silicon, does not reach single-phase α at 1200 °C either, in the database that carries silicon (Section 3.4). Silicon at its measured level does not obstruct the α field once carbon is removed (Section 4.2). Section 2.1 now states that chemical homogeneity within a heat was not checked.</w:t>
-      </w:r>
-    </w:p>
-    <w:p>
-      <w:pPr>
-        <w:pStyle w:val="Compact"/>
-        <w:numPr>
-          <w:ilvl w:val="0"/>
-          <w:numId w:val="1015"/>
+        <w:t xml:space="preserve">Its effect on phase stability was evaluated by calculation (Section 3.4). With carbon removed, the two databases that carry silicon at its measured level both return single-phase α at 1200 °C (Table 3), so the silicon shortfall is not what closes the α field. Whether the intended silicon would have opened the field with carbon present cannot be answered from these calculations: the one database in which the nominal composition was evaluated with its silicon places it partly molten at 1200 °C, and Section 3.4 says so. Section 2.1 now states that chemical homogeneity within a heat was not checked.</w:t>
+      </w:r>
+    </w:p>
+    <w:p>
+      <w:pPr>
+        <w:pStyle w:val="Compact"/>
+        <w:numPr>
+          <w:ilvl w:val="0"/>
+          <w:numId w:val="1016"/>
         </w:numPr>
       </w:pPr>
       <w:r>
@@ -1601,7 +1606,7 @@
         <w:pStyle w:val="Compact"/>
         <w:numPr>
           <w:ilvl w:val="0"/>
-          <w:numId w:val="1016"/>
+          <w:numId w:val="1017"/>
         </w:numPr>
       </w:pPr>
       <w:r>
@@ -1613,7 +1618,7 @@
         <w:pStyle w:val="FirstParagraph"/>
       </w:pPr>
       <w:r>
-        <w:t xml:space="preserve">Section 2.1 reports the phosphorus (0.06 wt%, ≈0.10 at%; source unknown, most plausibly a residual from the melting stock). This is below the level at which grain-boundary embrittlement is normally reported in Fe-Mn austenitic and duplex alloys. Any effect could only degrade the benchmark, which makes the comparison conservative. Phosphorus is included in the calculations wherever the database carries it (mc_fe, Section 2.6). The benchmark is now described as a reference composition processed in parallel (comment 7), so its validity as a reference rests on the transformation it showed under the common route, not on optimized properties.</w:t>
+        <w:t xml:space="preserve">Section 2.1 now discusses the phosphorus (0.06 wt%, ≈0.10 at%; source unknown, most plausibly a residual from the melting stock). Phosphorus can segregate to grain boundaries and embrittle them; its effect on the Omori alloy was not examined, but any such effect could only have degraded the reference behavior, and the Omori alloy still showed a stress-induced transformation. Phosphorus is included in the calculations in the one database that carries it (mc_fe, Section 2.6). The Omori alloy is now described as a reference composition processed in parallel (comment 7), so its validity as a reference rests on the transformation it showed under the common route, not on optimized properties.</w:t>
       </w:r>
     </w:p>
     <w:bookmarkEnd w:id="15"/>
@@ -1631,7 +1636,7 @@
         <w:pStyle w:val="Compact"/>
         <w:numPr>
           <w:ilvl w:val="0"/>
-          <w:numId w:val="1017"/>
+          <w:numId w:val="1018"/>
         </w:numPr>
       </w:pPr>
       <w:r>
@@ -1643,15 +1648,15 @@
         <w:pStyle w:val="FirstParagraph"/>
       </w:pPr>
       <w:r>
-        <w:t xml:space="preserve">Done (Sections 2.6 and 3.4; Tables 3 and 4; Fig. 9). Equilibrium step diagrams were calculated on the measured chemistry in three independently assessed open databases, two of which reproduce the benchmark’s single-phase α field without fitting. In all three, the LLM-alloy is α + γ at 1200 °C and begins to melt (≈1240–1295 °C) before any single-phase α field opens. Section 4.2 relates the alloy to the Ni-alloyed Fe-Mn-Al-C low-density steels, whose chemistry it shares.</w:t>
-      </w:r>
-    </w:p>
-    <w:p>
-      <w:pPr>
-        <w:pStyle w:val="Compact"/>
-        <w:numPr>
-          <w:ilvl w:val="0"/>
-          <w:numId w:val="1018"/>
+        <w:t xml:space="preserve">Done (Sections 2.6 and 3.4; Table 3). Equilibrium phase stability was calculated on the measured chemistry in three independently assessed open databases, two of which reproduce the Omori alloy’s single-phase α field without fitting. In all three, the LLM alloy is α + γ at 1200 °C and begins to melt (≈1240–1295 °C) before any single-phase α field opens.</w:t>
+      </w:r>
+    </w:p>
+    <w:p>
+      <w:pPr>
+        <w:pStyle w:val="Compact"/>
+        <w:numPr>
+          <w:ilvl w:val="0"/>
+          <w:numId w:val="1019"/>
         </w:numPr>
       </w:pPr>
       <w:r>
@@ -1663,24 +1668,24 @@
         <w:pStyle w:val="FirstParagraph"/>
       </w:pPr>
       <w:r>
-        <w:t xml:space="preserve">Yes. We added a virtual carbon-free control: the measured chemistry with carbon removed and every other element held fixed. It opens a single-phase α field at ≈1130–1160 °C in all three databases, and a nickel scan shows that restoring the benchmark’s nickel does not open the field while carbon is present (Sections 3.4 and 4.2). On that basis the paper’s claim is narrower than</w:t>
-      </w:r>
-      <w:r>
-        <w:t xml:space="preserve"> </w:t>
-      </w:r>
-      <w:r>
-        <w:t xml:space="preserve">“carbon caused the failure”</w:t>
-      </w:r>
-      <w:r>
-        <w:t xml:space="preserve">: on the calculation, carbon closes the single-phase α field at the solution-treatment temperature. Whether that closure is the operative cause of the null result is left open (Sections 4.1 and 4.2). Casting the carbon-free heat is named as the direct experiment (Sections 4.2 and 4.4).</w:t>
-      </w:r>
-    </w:p>
-    <w:p>
-      <w:pPr>
-        <w:pStyle w:val="Compact"/>
-        <w:numPr>
-          <w:ilvl w:val="0"/>
-          <w:numId w:val="1019"/>
+        <w:t xml:space="preserve">Yes. The Abstract, Section 4.1 and the Conclusions now present carbon as</w:t>
+      </w:r>
+      <w:r>
+        <w:t xml:space="preserve"> </w:t>
+      </w:r>
+      <w:r>
+        <w:t xml:space="preserve">“one plausible contributor … not a demonstrated cause”</w:t>
+      </w:r>
+      <w:r>
+        <w:t xml:space="preserve">. To inform that statement we added a calculated carbon-free control: the measured chemistry with carbon removed and every other element held fixed. It opens a single-phase α field at ≈1130–1160 °C in all three databases, whereas restoring the Omori alloy’s nickel or raising aluminum to the top of the proposed range does not open the field at 1200 °C, and silicon at its measured level does not obstruct it (Section 3.4). Section 4.1 states why this does not make carbon the demonstrated cause: the five alloying additions change together between the two heats, the calculation describes equilibrium rather than the quenched wire, and casting a carbon-free heat is the direct test (also named in Section 4.3).</w:t>
+      </w:r>
+    </w:p>
+    <w:p>
+      <w:pPr>
+        <w:pStyle w:val="Compact"/>
+        <w:numPr>
+          <w:ilvl w:val="0"/>
+          <w:numId w:val="1020"/>
         </w:numPr>
       </w:pPr>
       <w:r>
@@ -1700,7 +1705,7 @@
         <w:pStyle w:val="Compact"/>
         <w:numPr>
           <w:ilvl w:val="0"/>
-          <w:numId w:val="1020"/>
+          <w:numId w:val="1021"/>
         </w:numPr>
       </w:pPr>
       <w:r>
@@ -1712,7 +1717,7 @@
         <w:pStyle w:val="FirstParagraph"/>
       </w:pPr>
       <w:r>
-        <w:t xml:space="preserve">Done. Section 4.1 now states that element-by-element stabilizer rules cannot decide the balance in a six-element alloy and attributes the conclusion to the multicomponent calculation. Section 4.2 shows that a Schaeffler-type nickel equivalent ranks the two alloys the wrong way round, and explains why.</w:t>
+        <w:t xml:space="preserve">Done. Section 4.1 now states that element-by-element stabilizer rules cannot decide the balance in a six-element alloy, and bases the discussion on the multicomponent calculation of Section 3.4.</w:t>
       </w:r>
     </w:p>
     <w:bookmarkEnd w:id="16"/>
@@ -1730,7 +1735,7 @@
         <w:pStyle w:val="Compact"/>
         <w:numPr>
           <w:ilvl w:val="0"/>
-          <w:numId w:val="1021"/>
+          <w:numId w:val="1022"/>
         </w:numPr>
       </w:pPr>
       <w:r>
@@ -1742,7 +1747,7 @@
         <w:pStyle w:val="FirstParagraph"/>
       </w:pPr>
       <w:r>
-        <w:t xml:space="preserve">Sections 2.1 and 2.2 now give the route: vacuum induction melting (≈2 kg) to ø50 mm ingots, EDM to ø13 mm rods, homogenization at 1000 °C for 16 h in argon, hot rolling at 850 °C in multiple passes, and cold drawing with intermediate anneals at 1000 °C in argon, to 0.36 mm (LLM-alloy) and 0.64 mm (benchmark) wire with ≈85% area reduction after the last process anneal. They also give every final heat treatment, including the cyclic schedules. Table S1 lists the condition of every tested specimen.</w:t>
+        <w:t xml:space="preserve">Sections 2.1 and 2.2 give the route: vacuum induction melting (≈2 kg) to ø50 mm ingots, EDM to ø13 mm rods, homogenization at 1000 °C for 16 h in argon, hot rolling at 850 °C in multiple passes, and cold drawing with intermediate anneals at 1000 °C in argon, to 0.36 mm (LLM alloy) and 0.64 mm (Omori alloy) wire with ≈85% area reduction after the last process anneal. They also give every final heat treatment, including the cyclic schedules. Table S1 lists the condition of every tested specimen.</w:t>
       </w:r>
       <w:r>
         <w:t xml:space="preserve"> </w:t>
@@ -1760,7 +1765,7 @@
         <w:pStyle w:val="Compact"/>
         <w:numPr>
           <w:ilvl w:val="0"/>
-          <w:numId w:val="1022"/>
+          <w:numId w:val="1023"/>
         </w:numPr>
       </w:pPr>
       <w:r>
@@ -1772,7 +1777,7 @@
         <w:pStyle w:val="FirstParagraph"/>
       </w:pPr>
       <w:r>
-        <w:t xml:space="preserve">(Now Fig. 2h.) The age followed the 1200 °C/1 min strand anneal (Section 2.2).</w:t>
+        <w:t xml:space="preserve">Section 2.2 now defines it: the 1200 °C/1 min wire was aged at 200 °C for 3 hours.</w:t>
       </w:r>
       <w:r>
         <w:t xml:space="preserve"> </w:t>
@@ -1790,7 +1795,7 @@
         <w:pStyle w:val="Compact"/>
         <w:numPr>
           <w:ilvl w:val="0"/>
-          <w:numId w:val="1023"/>
+          <w:numId w:val="1024"/>
         </w:numPr>
       </w:pPr>
       <w:r>
@@ -1802,7 +1807,7 @@
         <w:pStyle w:val="FirstParagraph"/>
       </w:pPr>
       <w:r>
-        <w:t xml:space="preserve">Line speed was 4 ft min⁻¹. Section 2.2 now states that</w:t>
+        <w:t xml:space="preserve">Line speed was 4 ft min⁻¹ where the record states it. Section 2.2 now states that</w:t>
       </w:r>
       <w:r>
         <w:t xml:space="preserve"> </w:t>
@@ -1832,7 +1837,7 @@
         <w:pStyle w:val="Compact"/>
         <w:numPr>
           <w:ilvl w:val="0"/>
-          <w:numId w:val="1024"/>
+          <w:numId w:val="1025"/>
         </w:numPr>
       </w:pPr>
       <w:r>
@@ -1844,7 +1849,7 @@
         <w:pStyle w:val="FirstParagraph"/>
       </w:pPr>
       <w:r>
-        <w:t xml:space="preserve">Treatments above 1200 °C caused severe oxidation and are not reported. Section 2.2 now states that surface oxidation and decarburization during treatments at or below 1200 °C were not measured, and Section 4.3 lists them among the possible causes of the lower elongation above 1000 °C.</w:t>
+        <w:t xml:space="preserve">Treatments above 1200 °C caused severe oxidation and are not reported. Section 2.2 now states that surface oxidation and decarburization during treatments at or below 1200 °C were not measured, and Section 4.2 lists them among the possible causes of the lower elongation above 1000 °C.</w:t>
       </w:r>
       <w:r>
         <w:t xml:space="preserve"> </w:t>
@@ -1872,7 +1877,7 @@
         <w:pStyle w:val="Compact"/>
         <w:numPr>
           <w:ilvl w:val="0"/>
-          <w:numId w:val="1025"/>
+          <w:numId w:val="1026"/>
         </w:numPr>
       </w:pPr>
       <w:r>
@@ -1884,15 +1889,15 @@
         <w:pStyle w:val="FirstParagraph"/>
       </w:pPr>
       <w:r>
-        <w:t xml:space="preserve">The heating test was applied to both alloys in the same condition, 1200 °C for 1 minute, the condition used throughout the anneal series. Both alloys were also given the cyclic abnormal-grain-growth treatment (Section 3.5), but the heating test was not applied to the treated material: the treated LLM-alloy rod fractured at 0.5–1.0% elongation, below the 3% loading of the heating protocol, and the treated wire was not tested this way (Section 3.5). We agree that the comparison therefore does not set the LLM-alloy against the benchmark at its best, and have changed the benchmark’s description accordingly (below).</w:t>
-      </w:r>
-    </w:p>
-    <w:p>
-      <w:pPr>
-        <w:pStyle w:val="Compact"/>
-        <w:numPr>
-          <w:ilvl w:val="0"/>
-          <w:numId w:val="1026"/>
+        <w:t xml:space="preserve">The heating test was applied to both alloys in the same condition, 1200 °C for 1 minute, the condition used throughout the anneal series; Section 2.1 now states this, and that the Omori alloy was not compared after the abnormal-grain-growth and aging route by which it reaches its superelasticity. The cyclic treatment was applied to the LLM alloy (Section 2.2), but the treated rod tested on the 127 mm gauge fractured at 0.5–1.0% elongation, below the 3% loading of the heating protocol, and the treated wire was not given that test (Section 3.2). We agree that the comparison therefore does not set the LLM alloy against the Omori alloy at its best, and have changed the Omori alloy’s description accordingly (below).</w:t>
+      </w:r>
+    </w:p>
+    <w:p>
+      <w:pPr>
+        <w:pStyle w:val="Compact"/>
+        <w:numPr>
+          <w:ilvl w:val="0"/>
+          <w:numId w:val="1027"/>
         </w:numPr>
       </w:pPr>
       <w:r>
@@ -1908,39 +1913,30 @@
           <w:b/>
           <w:bCs/>
         </w:rPr>
-        <w:t xml:space="preserve">[OPEN — FC: confirm that no benchmark cyclic unloading record exists for this condition.]</w:t>
-      </w:r>
-      <w:r>
-        <w:t xml:space="preserve"> </w:t>
-      </w:r>
-      <w:r>
-        <w:t xml:space="preserve">We have adopted the reviewer’s description. Section 2.1 now defines the benchmark as</w:t>
-      </w:r>
-      <w:r>
-        <w:t xml:space="preserve"> </w:t>
-      </w:r>
-      <w:r>
-        <w:t xml:space="preserve">“a reference composition processed in parallel, not a superelastic control whose treatment was optimized”</w:t>
-      </w:r>
-      <w:r>
-        <w:t xml:space="preserve">; its transformation under the common route is used only as evidence that the route and tests can detect one. Section 3.2 describes its 0.5% recovery as a single observed heating-induced (shape-memory) recovery, and Section 3.3 now states that the benchmark’s transformation rests on three observations, each limited on its own, rather than being</w:t>
-      </w:r>
-      <w:r>
-        <w:t xml:space="preserve"> </w:t>
-      </w:r>
-      <w:r>
-        <w:t xml:space="preserve">“not in question”</w:t>
-      </w:r>
-      <w:r>
-        <w:t xml:space="preserve">.</w:t>
-      </w:r>
-    </w:p>
-    <w:p>
-      <w:pPr>
-        <w:pStyle w:val="Compact"/>
-        <w:numPr>
-          <w:ilvl w:val="0"/>
-          <w:numId w:val="1027"/>
+        <w:t xml:space="preserve">[OPEN — FC: confirm that no cyclic unloading record of the Omori alloy exists for this condition.]</w:t>
+      </w:r>
+      <w:r>
+        <w:t xml:space="preserve"> </w:t>
+      </w:r>
+      <w:r>
+        <w:t xml:space="preserve">We have adopted the reviewer’s description. Section 2.1 now defines the Omori alloy as</w:t>
+      </w:r>
+      <w:r>
+        <w:t xml:space="preserve"> </w:t>
+      </w:r>
+      <w:r>
+        <w:t xml:space="preserve">“a reference composition processed in parallel, not … a superelastic control whose treatment was optimized”</w:t>
+      </w:r>
+      <w:r>
+        <w:t xml:space="preserve">; its transformation under the common route is used only as evidence that the route and tests can detect one. Section 3.2 describes its 0.5% recovery as a single observed heating-induced (shape-memory) recovery, and Section 3.3 states that its transformation rests on three observations, each limited on its own.</w:t>
+      </w:r>
+    </w:p>
+    <w:p>
+      <w:pPr>
+        <w:pStyle w:val="Compact"/>
+        <w:numPr>
+          <w:ilvl w:val="0"/>
+          <w:numId w:val="1028"/>
         </w:numPr>
       </w:pPr>
       <w:r>
@@ -1952,15 +1948,15 @@
         <w:pStyle w:val="FirstParagraph"/>
       </w:pPr>
       <w:r>
-        <w:t xml:space="preserve">The specimen was 0.536 mm wire annealed at 1200 °C for 1 minute, with no aging (Table S1). No micrograph of the benchmark in this condition is reported, so its grain-size-to-diameter ratio, morphology and orientation are known only from the coarse, spotty diffraction of a specimen in the same condition (Fig. 4c). That pattern shows α with γ and B2 reflections; its phase fractions could not be refined. Section 3.3 now states these limitations.</w:t>
-      </w:r>
-    </w:p>
-    <w:p>
-      <w:pPr>
-        <w:pStyle w:val="Compact"/>
-        <w:numPr>
-          <w:ilvl w:val="0"/>
-          <w:numId w:val="1028"/>
+        <w:t xml:space="preserve">The specimen was 0.536 mm wire annealed at 1200 °C for 1 minute, with no aging (Table S1). No micrograph of the Omori alloy in this condition is available, so its grain-size-to-diameter ratio, morphology and orientation are known only from the coarse, spotty diffraction of a specimen in the same condition (Fig. 4c). That pattern shows α with γ and B2 reflections; its phase fractions could not be refined. Section 3.3 now states these limitations.</w:t>
+      </w:r>
+    </w:p>
+    <w:p>
+      <w:pPr>
+        <w:pStyle w:val="Compact"/>
+        <w:numPr>
+          <w:ilvl w:val="0"/>
+          <w:numId w:val="1029"/>
         </w:numPr>
       </w:pPr>
       <w:r>
@@ -1984,13 +1980,22 @@
         <w:pStyle w:val="FirstParagraph"/>
       </w:pPr>
       <w:r>
-        <w:t xml:space="preserve">Yes; see (b). The Abstract now reads</w:t>
-      </w:r>
-      <w:r>
-        <w:t xml:space="preserve"> </w:t>
-      </w:r>
-      <w:r>
-        <w:t xml:space="preserve">“a benchmark Fe-Mn-Al-Ni alloy processed in parallel”</w:t>
+        <w:t xml:space="preserve">Yes; see (b). The Abstract now describes it as</w:t>
+      </w:r>
+      <w:r>
+        <w:t xml:space="preserve"> </w:t>
+      </w:r>
+      <w:r>
+        <w:t xml:space="preserve">“an Fe-Mn-Al-Ni reference alloy of established superelastic composition processed in parallel”</w:t>
+      </w:r>
+      <w:r>
+        <w:t xml:space="preserve">, and the Conclusions as</w:t>
+      </w:r>
+      <w:r>
+        <w:t xml:space="preserve"> </w:t>
+      </w:r>
+      <w:r>
+        <w:t xml:space="preserve">“a reference composition processed in parallel”</w:t>
       </w:r>
       <w:r>
         <w:t xml:space="preserve">.</w:t>
@@ -2011,7 +2016,7 @@
         <w:pStyle w:val="Compact"/>
         <w:numPr>
           <w:ilvl w:val="0"/>
-          <w:numId w:val="1029"/>
+          <w:numId w:val="1030"/>
         </w:numPr>
       </w:pPr>
       <w:r>
@@ -2023,15 +2028,15 @@
         <w:pStyle w:val="FirstParagraph"/>
       </w:pPr>
       <w:r>
-        <w:t xml:space="preserve">No transformation-temperature data are available for these conditions, and the manuscript states this (Sections 4.1, 4.4 and 5). The conclusions that would depend on parent-phase stability at room temperature are presented as an open question with two readings (Section 4.1). DSC of the strand-annealed wire, with the benchmark as control, is named as the test that would discriminate between them (Section 4.4).</w:t>
-      </w:r>
-    </w:p>
-    <w:p>
-      <w:pPr>
-        <w:pStyle w:val="Compact"/>
-        <w:numPr>
-          <w:ilvl w:val="0"/>
-          <w:numId w:val="1030"/>
+        <w:t xml:space="preserve">No transformation-temperature data are available for these conditions, and the manuscript states this (Section 4.1). The conclusion that would depend on parent-phase stability at room temperature is presented as an open question with two readings (Section 4.1), and differential scanning calorimetry is named as the test that would discriminate between them (Sections 4.1 and 4.3).</w:t>
+      </w:r>
+    </w:p>
+    <w:p>
+      <w:pPr>
+        <w:pStyle w:val="Compact"/>
+        <w:numPr>
+          <w:ilvl w:val="0"/>
+          <w:numId w:val="1031"/>
         </w:numPr>
       </w:pPr>
       <w:r>
@@ -2043,22 +2048,34 @@
         <w:pStyle w:val="FirstParagraph"/>
       </w:pPr>
       <w:r>
-        <w:t xml:space="preserve">It is now presented that way. Section 4.1 concludes that attributing the null result to the missing single-phase parent state is</w:t>
-      </w:r>
-      <w:r>
-        <w:t xml:space="preserve"> </w:t>
-      </w:r>
-      <w:r>
-        <w:t xml:space="preserve">“an interpretation consistent with both readings but established by neither”</w:t>
-      </w:r>
-      <w:r>
-        <w:t xml:space="preserve">, and the Conclusions place it under</w:t>
-      </w:r>
-      <w:r>
-        <w:t xml:space="preserve"> </w:t>
-      </w:r>
-      <w:r>
-        <w:t xml:space="preserve">“Open”</w:t>
+        <w:t xml:space="preserve">It is now presented that way. Section 4.1 is retitled</w:t>
+      </w:r>
+      <w:r>
+        <w:t xml:space="preserve"> </w:t>
+      </w:r>
+      <w:r>
+        <w:t xml:space="preserve">“Interpreting the absence of stress-induced phase transformation”</w:t>
+      </w:r>
+      <w:r>
+        <w:t xml:space="preserve"> </w:t>
+      </w:r>
+      <w:r>
+        <w:t xml:space="preserve">and concludes that attributing the null result to the missing single-phase parent state is</w:t>
+      </w:r>
+      <w:r>
+        <w:t xml:space="preserve"> </w:t>
+      </w:r>
+      <w:r>
+        <w:t xml:space="preserve">“an interpretation consistent with both readings, not a demonstrated mechanism”</w:t>
+      </w:r>
+      <w:r>
+        <w:t xml:space="preserve">; the Conclusions say that this</w:t>
+      </w:r>
+      <w:r>
+        <w:t xml:space="preserve"> </w:t>
+      </w:r>
+      <w:r>
+        <w:t xml:space="preserve">“remains open”</w:t>
       </w:r>
       <w:r>
         <w:t xml:space="preserve">.</w:t>
@@ -2069,7 +2086,7 @@
         <w:pStyle w:val="Compact"/>
         <w:numPr>
           <w:ilvl w:val="0"/>
-          <w:numId w:val="1031"/>
+          <w:numId w:val="1032"/>
         </w:numPr>
       </w:pPr>
       <w:r>
@@ -2124,7 +2141,7 @@
         <w:pStyle w:val="Compact"/>
         <w:numPr>
           <w:ilvl w:val="0"/>
-          <w:numId w:val="1032"/>
+          <w:numId w:val="1033"/>
         </w:numPr>
       </w:pPr>
       <w:r>
@@ -2136,7 +2153,7 @@
         <w:pStyle w:val="FirstParagraph"/>
       </w:pPr>
       <w:r>
-        <w:t xml:space="preserve">Strain is crosshead extension divided by the instrument gauge length, without extensometry. No correction for load-train compliance or grip slip was applied, so the moduli in Table 2 are apparent. Because crosshead strain over a short gauge is dominated by compliance, elongations measured on different gauges are not compared anywhere in the paper (Section 2.4). The anneal series was tested on a 127 mm gauge (the original</w:t>
+        <w:t xml:space="preserve">Strain is crosshead extension divided by the gauge length, without extensometry. No correction for load-train compliance or grip slip was applied, so the moduli in Table 2 are apparent (Section 2.4). The anneal series was tested on a 127 mm gauge (the original</w:t>
       </w:r>
       <w:r>
         <w:t xml:space="preserve"> </w:t>
@@ -2156,7 +2173,7 @@
         <w:pStyle w:val="Compact"/>
         <w:numPr>
           <w:ilvl w:val="0"/>
-          <w:numId w:val="1033"/>
+          <w:numId w:val="1034"/>
         </w:numPr>
       </w:pPr>
       <w:r>
@@ -2168,7 +2185,7 @@
         <w:pStyle w:val="FirstParagraph"/>
       </w:pPr>
       <w:r>
-        <w:t xml:space="preserve">Section 2.4 gives the standard (broadly ASTM E8/E8M; the cyclic protocol is the purpose-designed method of our earlier work, Cai et al. 2024), the increment (nominally 1% strain per cycle), and the crosshead speed.</w:t>
+        <w:t xml:space="preserve">Section 2.4 gives the standard (broadly ASTM E8/E8M; the cyclic protocol is the purpose-designed method of our earlier work, Cai et al. 2024), the increment (nominally 1% strain per cycle) and the crosshead speed.</w:t>
       </w:r>
       <w:r>
         <w:t xml:space="preserve"> </w:t>
@@ -2186,7 +2203,7 @@
         <w:pStyle w:val="Compact"/>
         <w:numPr>
           <w:ilvl w:val="0"/>
-          <w:numId w:val="1034"/>
+          <w:numId w:val="1035"/>
         </w:numPr>
       </w:pPr>
       <w:r>
@@ -2216,7 +2233,7 @@
         <w:pStyle w:val="Compact"/>
         <w:numPr>
           <w:ilvl w:val="0"/>
-          <w:numId w:val="1035"/>
+          <w:numId w:val="1036"/>
         </w:numPr>
       </w:pPr>
       <w:r>
@@ -2244,7 +2261,7 @@
         <w:t xml:space="preserve"> </w:t>
       </w:r>
       <w:r>
-        <w:t xml:space="preserve">Section 2.4 now says so and identifies the values as protocol-dependent. Section 4.3 compares them with monotonic literature data only with that qualification.</w:t>
+        <w:t xml:space="preserve">Section 2.4 now says so and identifies the values as protocol-dependent, and Section 4.2 compares them with monotonic data only with that qualification.</w:t>
       </w:r>
     </w:p>
     <w:bookmarkEnd w:id="20"/>
@@ -2262,7 +2279,7 @@
         <w:pStyle w:val="Compact"/>
         <w:numPr>
           <w:ilvl w:val="0"/>
-          <w:numId w:val="1036"/>
+          <w:numId w:val="1037"/>
         </w:numPr>
       </w:pPr>
       <w:r>
@@ -2274,15 +2291,15 @@
         <w:pStyle w:val="FirstParagraph"/>
       </w:pPr>
       <w:r>
-        <w:t xml:space="preserve">Each alloy is a single heat. Table S1 (Online Resource 2) lists every specimen behind every figure and table, with its heat, form, measured diameter, condition, test, gauge length and count. Every condition of Table 2 is now the mean of three specimens. The aged condition, the prolonged and cyclic conditions, and both heating tests are single specimens, and the text says so where each appears. Each diffraction condition is one specimen, with one or two frames (Section 2.5).</w:t>
-      </w:r>
-    </w:p>
-    <w:p>
-      <w:pPr>
-        <w:pStyle w:val="Compact"/>
-        <w:numPr>
-          <w:ilvl w:val="0"/>
-          <w:numId w:val="1037"/>
+        <w:t xml:space="preserve">Each alloy is a single heat. Table S1 (Online Resource 2) lists every specimen behind every figure, table and statement in the text, with its heat, form, measured diameter, condition, test, gauge length and count. Every condition of Table 2 is now the mean of three specimens. The aged condition and both heating tests are single specimens, and the prolonged and cyclic conditions one or two specimens each; the text says so (Sections 2.4 and 3.2). Each diffraction condition is one specimen, with one or two frames (Section 2.5).</w:t>
+      </w:r>
+    </w:p>
+    <w:p>
+      <w:pPr>
+        <w:pStyle w:val="Compact"/>
+        <w:numPr>
+          <w:ilvl w:val="0"/>
+          <w:numId w:val="1038"/>
         </w:numPr>
       </w:pPr>
       <w:r>
@@ -2294,15 +2311,25 @@
         <w:pStyle w:val="FirstParagraph"/>
       </w:pPr>
       <w:r>
-        <w:t xml:space="preserve">Table 2 reports mean ± one standard deviation over three specimens. Each panel of Fig. 2 shows one representative specimen, and the caption says so. Single observations are designated as such.</w:t>
-      </w:r>
-    </w:p>
-    <w:p>
-      <w:pPr>
-        <w:pStyle w:val="Compact"/>
-        <w:numPr>
-          <w:ilvl w:val="0"/>
-          <w:numId w:val="1038"/>
+        <w:t xml:space="preserve">Table 2 reports mean ± one standard deviation over three specimens. Each panel of Fig. 2 shows one specimen, and the caption says so. Single observations are designated as such.</w:t>
+      </w:r>
+      <w:r>
+        <w:t xml:space="preserve"> </w:t>
+      </w:r>
+      <w:r>
+        <w:rPr>
+          <w:b/>
+          <w:bCs/>
+        </w:rPr>
+        <w:t xml:space="preserve">[OPEN — FC: the individual values of the three specimens per condition, if they are in your records (the source table gives mean ± SD only); if so, they go into Table S1.]</w:t>
+      </w:r>
+    </w:p>
+    <w:p>
+      <w:pPr>
+        <w:pStyle w:val="Compact"/>
+        <w:numPr>
+          <w:ilvl w:val="0"/>
+          <w:numId w:val="1039"/>
         </w:numPr>
       </w:pPr>
       <w:r>
@@ -2338,13 +2365,13 @@
         <w:pStyle w:val="FirstParagraph"/>
       </w:pPr>
       <w:r>
-        <w:t xml:space="preserve">Done. Section 4.3 reads the anneal series</w:t>
-      </w:r>
-      <w:r>
-        <w:t xml:space="preserve"> </w:t>
-      </w:r>
-      <w:r>
-        <w:t xml:space="preserve">“as a survey rather than a designed experiment”</w:t>
+        <w:t xml:space="preserve">Done. Section 1 describes the work as an exploratory case study, and Section 4.2 reads the anneal series</w:t>
+      </w:r>
+      <w:r>
+        <w:t xml:space="preserve"> </w:t>
+      </w:r>
+      <w:r>
+        <w:t xml:space="preserve">“as an exploratory survey rather than a designed experiment”</w:t>
       </w:r>
       <w:r>
         <w:t xml:space="preserve">.</w:t>
@@ -2371,7 +2398,7 @@
         <w:t xml:space="preserve"> </w:t>
       </w:r>
       <w:r>
-        <w:t xml:space="preserve">have been replaced where they described measured trends, and claims of repeatability are confined to the replicated Table 2 values.</w:t>
+        <w:t xml:space="preserve">have been replaced, and claims of repeatability are confined to the replicated Table 2 values.</w:t>
       </w:r>
     </w:p>
     <w:bookmarkEnd w:id="21"/>
@@ -2389,7 +2416,7 @@
         <w:pStyle w:val="Compact"/>
         <w:numPr>
           <w:ilvl w:val="0"/>
-          <w:numId w:val="1039"/>
+          <w:numId w:val="1040"/>
         </w:numPr>
       </w:pPr>
       <w:r>
@@ -2413,7 +2440,7 @@
         <w:pStyle w:val="FirstParagraph"/>
       </w:pPr>
       <w:r>
-        <w:t xml:space="preserve">Section 2.4 now gives the sequence: the specimen was loaded to 3% strain, unloaded to zero stress, and the crosshead was then returned to its starting position (nominal zero strain); at the same time the specimen was heated to ≈200 °C at ≈50 °C s⁻¹ and held for ≈10 s, then reloaded.</w:t>
+        <w:t xml:space="preserve">Section 2.4 now gives the sequence: the specimen was loaded to 3% strain and unloaded to zero stress, and the crosshead was then returned to its starting position (nominal zero strain); at the same time the specimen was heated to ≈200 °C at ≈50 °C s⁻¹ and held for ≈10 s, and it was then reloaded. The Fig. 3 caption now identifies the three segments (unloading; return of the crosshead at zero stress during heating; reloading).</w:t>
       </w:r>
       <w:r>
         <w:t xml:space="preserve"> </w:t>
@@ -2431,7 +2458,7 @@
         <w:pStyle w:val="Compact"/>
         <w:numPr>
           <w:ilvl w:val="0"/>
-          <w:numId w:val="1040"/>
+          <w:numId w:val="1041"/>
         </w:numPr>
       </w:pPr>
       <w:r>
@@ -2447,21 +2474,21 @@
           <w:b/>
           <w:bCs/>
         </w:rPr>
-        <w:t xml:space="preserve">[OPEN — SC: temperature monitoring and cooling before reloading.]</w:t>
-      </w:r>
-      <w:r>
-        <w:t xml:space="preserve"> </w:t>
-      </w:r>
-      <w:r>
-        <w:t xml:space="preserve">No compliance or fixture-expansion correction was applied (Section 2.4).</w:t>
-      </w:r>
-    </w:p>
-    <w:p>
-      <w:pPr>
-        <w:pStyle w:val="Compact"/>
-        <w:numPr>
-          <w:ilvl w:val="0"/>
-          <w:numId w:val="1041"/>
+        <w:t xml:space="preserve">[OPEN — SC: temperature monitoring, cooling before reloading, and whether fixture expansion was corrected.]</w:t>
+      </w:r>
+      <w:r>
+        <w:t xml:space="preserve"> </w:t>
+      </w:r>
+      <w:r>
+        <w:t xml:space="preserve">No compliance correction was applied (Section 2.4).</w:t>
+      </w:r>
+    </w:p>
+    <w:p>
+      <w:pPr>
+        <w:pStyle w:val="Compact"/>
+        <w:numPr>
+          <w:ilvl w:val="0"/>
+          <w:numId w:val="1042"/>
         </w:numPr>
       </w:pPr>
       <w:r>
@@ -2491,7 +2518,7 @@
         <w:pStyle w:val="Compact"/>
         <w:numPr>
           <w:ilvl w:val="0"/>
-          <w:numId w:val="1042"/>
+          <w:numId w:val="1043"/>
         </w:numPr>
       </w:pPr>
       <w:r>
@@ -2566,7 +2593,7 @@
         <w:pStyle w:val="Compact"/>
         <w:numPr>
           <w:ilvl w:val="0"/>
-          <w:numId w:val="1043"/>
+          <w:numId w:val="1044"/>
         </w:numPr>
       </w:pPr>
       <w:r>
@@ -2578,15 +2605,15 @@
         <w:pStyle w:val="FirstParagraph"/>
       </w:pPr>
       <w:r>
-        <w:t xml:space="preserve">Section 3.1 now separates what is visible (two constituents of different contrast, their morphology, coarsening with time) from the inferences drawn from them. It does not assign either constituent as the matrix, and names EBSD as the measurement that would settle the remaining questions. Orientation information already available is reported from the synchrotron data: the inverse pole figures of Fig. 7 (Section 3.3).</w:t>
-      </w:r>
-    </w:p>
-    <w:p>
-      <w:pPr>
-        <w:pStyle w:val="Compact"/>
-        <w:numPr>
-          <w:ilvl w:val="0"/>
-          <w:numId w:val="1044"/>
+        <w:t xml:space="preserve">Section 3.1 now separates what is visible (two constituents of different contrast, their morphology, coarsening with time) from the inferences drawn from them, no longer assigns either constituent as the matrix, and names EBSD as the measurement that would distinguish grains from transformation products in Fig. 1d. The orientation information already available comes from the synchrotron data: the orientation distribution of the Rietveld refinement shows {111} and {100} fiber components in γ and a {110} fiber component in α along the wire axis, the drawing textures of cold-drawn FCC and BCC metals (Section 3.3).</w:t>
+      </w:r>
+    </w:p>
+    <w:p>
+      <w:pPr>
+        <w:pStyle w:val="Compact"/>
+        <w:numPr>
+          <w:ilvl w:val="0"/>
+          <w:numId w:val="1045"/>
         </w:numPr>
       </w:pPr>
       <w:r>
@@ -2616,7 +2643,7 @@
         <w:pStyle w:val="Compact"/>
         <w:numPr>
           <w:ilvl w:val="0"/>
-          <w:numId w:val="1045"/>
+          <w:numId w:val="1046"/>
         </w:numPr>
       </w:pPr>
       <w:r>
@@ -2646,7 +2673,7 @@
         <w:pStyle w:val="Compact"/>
         <w:numPr>
           <w:ilvl w:val="0"/>
-          <w:numId w:val="1046"/>
+          <w:numId w:val="1047"/>
         </w:numPr>
       </w:pPr>
       <w:r>
@@ -2658,38 +2685,7 @@
         <w:pStyle w:val="FirstParagraph"/>
       </w:pPr>
       <w:r>
-        <w:t xml:space="preserve">Yes. Fig. 1d (new) shows the 0.36 mm wire after the cyclic treatment, and Section 3.5 describes the treated rod.</w:t>
-      </w:r>
-      <w:r>
-        <w:t xml:space="preserve"> </w:t>
-      </w:r>
-      <w:r>
-        <w:rPr>
-          <w:b/>
-          <w:bCs/>
-        </w:rPr>
-        <w:t xml:space="preserve">[OPEN — FC: the rod micrographs (arrested coarsening, fine-grain band) and the benchmark bamboo wire are described as</w:t>
-      </w:r>
-      <w:r>
-        <w:rPr>
-          <w:b/>
-          <w:bCs/>
-        </w:rPr>
-        <w:t xml:space="preserve"> </w:t>
-      </w:r>
-      <w:r>
-        <w:rPr>
-          <w:b/>
-          <w:bCs/>
-        </w:rPr>
-        <w:t xml:space="preserve">“not shown”</w:t>
-      </w:r>
-      <w:r>
-        <w:rPr>
-          <w:b/>
-          <w:bCs/>
-        </w:rPr>
-        <w:t xml:space="preserve">. Recommend adding them to Online Resource 2; otherwise the detailed rod description must be cut back.]</w:t>
+        <w:t xml:space="preserve">Yes. Fig. 1d (new) shows the 0.36 mm wire after the cyclic treatment: it retains a fine, banded two-constituent structure, and no bamboo structure formed (Section 3.1). For the cyclically treated rod, the manuscript makes no claim about grain structure beyond its diffraction pattern (Section 3.3).</w:t>
       </w:r>
     </w:p>
     <w:bookmarkEnd w:id="23"/>
@@ -2707,7 +2703,7 @@
         <w:pStyle w:val="Compact"/>
         <w:numPr>
           <w:ilvl w:val="0"/>
-          <w:numId w:val="1047"/>
+          <w:numId w:val="1048"/>
         </w:numPr>
       </w:pPr>
       <w:r>
@@ -2719,7 +2715,7 @@
         <w:pStyle w:val="FirstParagraph"/>
       </w:pPr>
       <w:r>
-        <w:t xml:space="preserve">Section 2.5 now reports transmission geometry, a 4288 × 4288-pixel area detector with 100 µm pixels, a sample-to-detector distance of ≈1.83 m (refined to 1827.4 mm), beam centre and distance fitted from the rings themselves with a CeO₂ calibrant frame, and one or two frames per specimen. The exposure normalization of Fig. 6b is stated in its caption.</w:t>
+        <w:t xml:space="preserve">Section 2.5 now reports transmission geometry, a 4288 × 4288-pixel area detector with 100 µm pixels, a sample-to-detector distance of ≈1.83 m (refined to 1827.4 mm), beam center and distance fitted from the rings themselves with a CeO₂ calibrant frame, and one or two frames per specimen. The exposure normalization of Fig. 6b is stated in its caption.</w:t>
       </w:r>
       <w:r>
         <w:t xml:space="preserve"> </w:t>
@@ -2737,7 +2733,7 @@
         <w:pStyle w:val="Compact"/>
         <w:numPr>
           <w:ilvl w:val="0"/>
-          <w:numId w:val="1048"/>
+          <w:numId w:val="1049"/>
         </w:numPr>
       </w:pPr>
       <w:r>
@@ -2759,15 +2755,15 @@
         <w:t xml:space="preserve"> </w:t>
       </w:r>
       <w:r>
-        <w:t xml:space="preserve">Before and after deformation are separate specimens (Section 2.5), so the same volume was not sampled; Section 3.3 now notes that the different grains illuminated in a separate specimen could contribute to the observed changes.</w:t>
-      </w:r>
-    </w:p>
-    <w:p>
-      <w:pPr>
-        <w:pStyle w:val="Compact"/>
-        <w:numPr>
-          <w:ilvl w:val="0"/>
-          <w:numId w:val="1049"/>
+        <w:t xml:space="preserve">Before and after deformation are separate specimens (Section 2.5, Fig. 4 caption), so the same volume was not sampled; Section 3.3 notes that the different grains illuminated in a separate specimen may contribute to the observed changes.</w:t>
+      </w:r>
+    </w:p>
+    <w:p>
+      <w:pPr>
+        <w:pStyle w:val="Compact"/>
+        <w:numPr>
+          <w:ilvl w:val="0"/>
+          <w:numId w:val="1050"/>
         </w:numPr>
       </w:pPr>
       <w:r>
@@ -2797,7 +2793,7 @@
         <w:pStyle w:val="Compact"/>
         <w:numPr>
           <w:ilvl w:val="0"/>
-          <w:numId w:val="1050"/>
+          <w:numId w:val="1051"/>
         </w:numPr>
       </w:pPr>
       <w:r>
@@ -2809,7 +2805,7 @@
         <w:pStyle w:val="FirstParagraph"/>
       </w:pPr>
       <w:r>
-        <w:t xml:space="preserve">One specimen per alloy and condition, at one position, with one or two frames (Section 2.5; Table S1).</w:t>
+        <w:t xml:space="preserve">One specimen per alloy and condition, at one position, with one or two frames (Section 2.5, Fig. 4 caption; Table S1).</w:t>
       </w:r>
     </w:p>
     <w:bookmarkEnd w:id="24"/>
@@ -2827,7 +2823,7 @@
         <w:pStyle w:val="Compact"/>
         <w:numPr>
           <w:ilvl w:val="0"/>
-          <w:numId w:val="1051"/>
+          <w:numId w:val="1052"/>
         </w:numPr>
       </w:pPr>
       <w:r>
@@ -2841,43 +2837,73 @@
       <w:r>
         <w:t xml:space="preserve">Section 2.5 now reports:</w:t>
       </w:r>
-      <w:r>
-        <w:t xml:space="preserve"> </w:t>
-      </w:r>
-      <w:r>
-        <w:t xml:space="preserve">- the three-phase model and space groups, with lattice parameters fixed (values given);</w:t>
-      </w:r>
-      <w:r>
-        <w:t xml:space="preserve"> </w:t>
-      </w:r>
-      <w:r>
-        <w:t xml:space="preserve">- pseudo-Voigt profiles with a d-dependent Caglioti instrumental function and Popa anisotropic crystallite size;</w:t>
-      </w:r>
-      <w:r>
-        <w:t xml:space="preserve"> </w:t>
-      </w:r>
-      <w:r>
-        <w:t xml:space="preserve">- interpolated backgrounds, plus a sixth-order polynomial for the deformed pattern;</w:t>
-      </w:r>
-      <w:r>
-        <w:t xml:space="preserve"> </w:t>
-      </w:r>
-      <w:r>
-        <w:t xml:space="preserve">- the refined variables of each final refinement;</w:t>
-      </w:r>
-      <w:r>
-        <w:t xml:space="preserve"> </w:t>
-      </w:r>
-      <w:r>
-        <w:t xml:space="preserve">- E-WIMV texture at 2° and 5° ODF resolution.</w:t>
-      </w:r>
-    </w:p>
-    <w:p>
-      <w:pPr>
-        <w:pStyle w:val="BodyText"/>
-      </w:pPr>
-      <w:r>
-        <w:t xml:space="preserve">R_wp and R_p are given in the Fig. 5 caption. We do not quote MAUD’s goodness-of-fit value, which its weighting scheme does not make comparable to a conventional χ². The basis of the phase fractions is stated plainly. They were not varied in the final refinements: the undeformed pattern’s were held at the values of an earlier refinement stage, and the deformed pattern’s are not reported as a measurement. They therefore carry no least-squares uncertainty and are labelled semi-quantitative.</w:t>
+    </w:p>
+    <w:p>
+      <w:pPr>
+        <w:pStyle w:val="Compact"/>
+        <w:numPr>
+          <w:ilvl w:val="0"/>
+          <w:numId w:val="1053"/>
+        </w:numPr>
+      </w:pPr>
+      <w:r>
+        <w:t xml:space="preserve">the three-phase model and space groups, with lattice parameters fixed (values given);</w:t>
+      </w:r>
+    </w:p>
+    <w:p>
+      <w:pPr>
+        <w:pStyle w:val="Compact"/>
+        <w:numPr>
+          <w:ilvl w:val="0"/>
+          <w:numId w:val="1053"/>
+        </w:numPr>
+      </w:pPr>
+      <w:r>
+        <w:t xml:space="preserve">pseudo-Voigt profiles with a d-dependent Caglioti instrumental function and Popa anisotropic crystallite size;</w:t>
+      </w:r>
+    </w:p>
+    <w:p>
+      <w:pPr>
+        <w:pStyle w:val="Compact"/>
+        <w:numPr>
+          <w:ilvl w:val="0"/>
+          <w:numId w:val="1053"/>
+        </w:numPr>
+      </w:pPr>
+      <w:r>
+        <w:t xml:space="preserve">interpolated backgrounds;</w:t>
+      </w:r>
+    </w:p>
+    <w:p>
+      <w:pPr>
+        <w:pStyle w:val="Compact"/>
+        <w:numPr>
+          <w:ilvl w:val="0"/>
+          <w:numId w:val="1053"/>
+        </w:numPr>
+      </w:pPr>
+      <w:r>
+        <w:t xml:space="preserve">the refined variables of each final refinement (undeformed and deformed);</w:t>
+      </w:r>
+    </w:p>
+    <w:p>
+      <w:pPr>
+        <w:pStyle w:val="Compact"/>
+        <w:numPr>
+          <w:ilvl w:val="0"/>
+          <w:numId w:val="1053"/>
+        </w:numPr>
+      </w:pPr>
+      <w:r>
+        <w:t xml:space="preserve">E-WIMV texture at 2° and 5° ODF resolution.</w:t>
+      </w:r>
+    </w:p>
+    <w:p>
+      <w:pPr>
+        <w:pStyle w:val="FirstParagraph"/>
+      </w:pPr>
+      <w:r>
+        <w:t xml:space="preserve">R_wp and R_p of both refinements are given in Section 3.3 and the Fig. 5 caption, which now shows both. We do not quote MAUD’s goodness-of-fit value, which its weighting scheme does not make comparable to a conventional χ². The basis of the phase fractions is stated plainly: they were not varied in either final refinement; the undeformed pattern’s were held at the values of an earlier refinement stage, and the deformed pattern’s are not reported as a measurement. They therefore carry no least-squares uncertainty and are labelled semi-quantitative.</w:t>
       </w:r>
       <w:r>
         <w:t xml:space="preserve"> </w:t>
@@ -2887,15 +2913,15 @@
           <w:b/>
           <w:bCs/>
         </w:rPr>
-        <w:t xml:space="preserve">[OPEN — FC/SC: confirm the earlier refinement stage that produced 0.62/0.34/0.04. Residual (difference) curves: MAUD saved neither analysis with its spectra, so Song must re-export observed/calculated/difference curves from the sessions with the .esg data, for a figure in Online Resource 2.]</w:t>
-      </w:r>
-    </w:p>
-    <w:p>
-      <w:pPr>
-        <w:pStyle w:val="Compact"/>
-        <w:numPr>
-          <w:ilvl w:val="0"/>
-          <w:numId w:val="1052"/>
+        <w:t xml:space="preserve">[OPEN — FC/SC: confirm the earlier refinement stage that produced 0.62/0.34/0.04. Residual (difference) curves: MAUD saved neither analysis with its spectra, so Song must re-export observed/calculated/difference curves from both sessions with the .esg data, for a figure in Online Resource 2.]</w:t>
+      </w:r>
+    </w:p>
+    <w:p>
+      <w:pPr>
+        <w:pStyle w:val="Compact"/>
+        <w:numPr>
+          <w:ilvl w:val="0"/>
+          <w:numId w:val="1054"/>
         </w:numPr>
       </w:pPr>
       <w:r>
@@ -2915,7 +2941,7 @@
         <w:pStyle w:val="Compact"/>
         <w:numPr>
           <w:ilvl w:val="0"/>
-          <w:numId w:val="1053"/>
+          <w:numId w:val="1055"/>
         </w:numPr>
       </w:pPr>
       <w:r>
@@ -2927,15 +2953,15 @@
         <w:pStyle w:val="FirstParagraph"/>
       </w:pPr>
       <w:r>
-        <w:t xml:space="preserve">Done. Section 3.3 discusses grain statistics in both alloys: they limit the LLM-alloy refinement and prevent refinement of the benchmark altogether. The fractions are labelled semi-quantitative in the Abstract, Section 3.3, Section 4.1 and the Conclusions.</w:t>
-      </w:r>
-    </w:p>
-    <w:p>
-      <w:pPr>
-        <w:pStyle w:val="Compact"/>
-        <w:numPr>
-          <w:ilvl w:val="0"/>
-          <w:numId w:val="1054"/>
+        <w:t xml:space="preserve">Done. Section 3.3 discusses grain statistics in both alloys: they limit the LLM-alloy refinement and prevent refinement of the Omori alloy altogether. The fractions are labelled semi-quantitative in the Abstract, Section 3.3, Section 4.1 and the Conclusions.</w:t>
+      </w:r>
+    </w:p>
+    <w:p>
+      <w:pPr>
+        <w:pStyle w:val="Compact"/>
+        <w:numPr>
+          <w:ilvl w:val="0"/>
+          <w:numId w:val="1056"/>
         </w:numPr>
       </w:pPr>
       <w:r>
@@ -2959,7 +2985,7 @@
         <w:t xml:space="preserve"> </w:t>
       </w:r>
       <w:r>
-        <w:t xml:space="preserve">was an error and has been removed.</w:t>
+        <w:t xml:space="preserve">was an error and has been removed (Section 4.1).</w:t>
       </w:r>
     </w:p>
     <w:bookmarkEnd w:id="25"/>
@@ -2977,7 +3003,7 @@
         <w:pStyle w:val="Compact"/>
         <w:numPr>
           <w:ilvl w:val="0"/>
-          <w:numId w:val="1055"/>
+          <w:numId w:val="1057"/>
         </w:numPr>
       </w:pPr>
       <w:r>
@@ -2989,15 +3015,15 @@
         <w:pStyle w:val="FirstParagraph"/>
       </w:pPr>
       <w:r>
-        <w:t xml:space="preserve">Yes. Section 3.3 now states that an ex-situ measurement after unloading cannot exclude a fully reversible transformation, and that the diffraction is corroboration of the mechanical evidence, not the other way round.</w:t>
-      </w:r>
-    </w:p>
-    <w:p>
-      <w:pPr>
-        <w:pStyle w:val="Compact"/>
-        <w:numPr>
-          <w:ilvl w:val="0"/>
-          <w:numId w:val="1056"/>
+        <w:t xml:space="preserve">Yes. Section 3.3 now states that an ex-situ measurement after unloading cannot exclude a fully reversible transformation, that the diffraction pattern describes the state retained after unloading, and that it corroborates the mechanical evidence rather than the other way round.</w:t>
+      </w:r>
+    </w:p>
+    <w:p>
+      <w:pPr>
+        <w:pStyle w:val="Compact"/>
+        <w:numPr>
+          <w:ilvl w:val="0"/>
+          <w:numId w:val="1058"/>
         </w:numPr>
       </w:pPr>
       <w:r>
@@ -3018,15 +3044,15 @@
         <w:t xml:space="preserve">“ex-situ”</w:t>
       </w:r>
       <w:r>
-        <w:t xml:space="preserve">, and the Conclusions state that a transformation reversing on unloading is bounded by the unloading curves rather than by diffraction. Those curves return no strain beyond elastic springback in any condition (Sections 3.2 and 3.5). An in-situ measurement is named as the direct test (Section 4.4).</w:t>
-      </w:r>
-    </w:p>
-    <w:p>
-      <w:pPr>
-        <w:pStyle w:val="Compact"/>
-        <w:numPr>
-          <w:ilvl w:val="0"/>
-          <w:numId w:val="1057"/>
+        <w:t xml:space="preserve">, Section 3.3 and the Conclusions state that a transformation reversing on unloading is bounded by the unloading curves rather than by diffraction (and Section 3.3 that the heating test only narrows the remaining route), and an in-situ measurement is named as the direct test (Sections 3.3 and 4.3).</w:t>
+      </w:r>
+    </w:p>
+    <w:p>
+      <w:pPr>
+        <w:pStyle w:val="Compact"/>
+        <w:numPr>
+          <w:ilvl w:val="0"/>
+          <w:numId w:val="1059"/>
         </w:numPr>
       </w:pPr>
       <w:r>
@@ -3050,15 +3076,15 @@
         <w:t xml:space="preserve"> </w:t>
       </w:r>
       <w:r>
-        <w:t xml:space="preserve">dislocation activity. Sections 3.3 and 4.1 note that it was not quantified and that texture evolution and the different grains sampled could also contribute.</w:t>
-      </w:r>
-    </w:p>
-    <w:p>
-      <w:pPr>
-        <w:pStyle w:val="Compact"/>
-        <w:numPr>
-          <w:ilvl w:val="0"/>
-          <w:numId w:val="1058"/>
+        <w:t xml:space="preserve">dislocation activity; Sections 3.3 and 4.1 note that it was not quantified and that texture evolution and the different grains sampled may also contribute.</w:t>
+      </w:r>
+    </w:p>
+    <w:p>
+      <w:pPr>
+        <w:pStyle w:val="Compact"/>
+        <w:numPr>
+          <w:ilvl w:val="0"/>
+          <w:numId w:val="1060"/>
         </w:numPr>
       </w:pPr>
       <w:r>
@@ -3074,13 +3100,13 @@
           <w:b/>
           <w:bCs/>
         </w:rPr>
-        <w:t xml:space="preserve">[OPEN — FC: why 10% for the LLM-alloy and 8% for the benchmark.]</w:t>
-      </w:r>
-      <w:r>
-        <w:t xml:space="preserve"> </w:t>
-      </w:r>
-      <w:r>
-        <w:t xml:space="preserve">The benchmark’s post-deformation spectrum is divided by 1.625, the exposure ratio recorded with the data, and the Fig. 6 caption now says so; the other spectra are as measured. The before/after comparisons are qualitative, and the text treats them so.</w:t>
+        <w:t xml:space="preserve">[OPEN — FC: why 10% for the LLM alloy and 8% for the Omori alloy.]</w:t>
+      </w:r>
+      <w:r>
+        <w:t xml:space="preserve"> </w:t>
+      </w:r>
+      <w:r>
+        <w:t xml:space="preserve">The Omori alloy’s post-deformation spectrum is divided by 1.625, the exposure ratio recorded with the data, and the Fig. 6 caption now says so; the other spectra are as measured. The before/after comparisons are qualitative, and the text treats them so.</w:t>
       </w:r>
     </w:p>
     <w:bookmarkEnd w:id="26"/>
@@ -3098,7 +3124,7 @@
         <w:pStyle w:val="Compact"/>
         <w:numPr>
           <w:ilvl w:val="0"/>
-          <w:numId w:val="1059"/>
+          <w:numId w:val="1061"/>
         </w:numPr>
       </w:pPr>
       <w:r>
@@ -3110,15 +3136,15 @@
         <w:pStyle w:val="FirstParagraph"/>
       </w:pPr>
       <w:r>
-        <w:t xml:space="preserve">The identification rests on superlattice intensities, now quantified in Section 3.3. The D0₃-only {111} reflection is present in the LLM-alloy at a signal-to-noise ratio of 16–27 across four patterns and absent from the benchmark. The B2-allowed {200} reflection in the LLM-alloy is at most ≈0.3 of the benchmark’s intensity, and is fully accounted for by D0₃. Spatial scale is not established. Section 3.3 states that transmission electron microscopy or atom-probe tomography would be required, and the assignments are treated as tentative at the nanoscale.</w:t>
-      </w:r>
-    </w:p>
-    <w:p>
-      <w:pPr>
-        <w:pStyle w:val="Compact"/>
-        <w:numPr>
-          <w:ilvl w:val="0"/>
-          <w:numId w:val="1060"/>
+        <w:t xml:space="preserve">The identification rests on superlattice intensities, now quantified in Section 3.3. The D0₃-only {111} reflection is present in the LLM alloy at a signal-to-noise ratio of 16–27 across four patterns and absent from the Omori alloy. The intensity at the B2-allowed {200} position in the LLM alloy (0.50–1.06% of maximum) is at most about 0.3 of the Omori alloy’s (3.83–7.17%) and is accounted for by D0₃. Spatial scale is not established; Section 3.3 states that transmission electron microscopy or atom-probe tomography would be required, and that a finer or more dilute B2 dispersion cannot be excluded.</w:t>
+      </w:r>
+    </w:p>
+    <w:p>
+      <w:pPr>
+        <w:pStyle w:val="Compact"/>
+        <w:numPr>
+          <w:ilvl w:val="0"/>
+          <w:numId w:val="1062"/>
         </w:numPr>
       </w:pPr>
       <w:r>
@@ -3138,7 +3164,7 @@
         <w:pStyle w:val="Compact"/>
         <w:numPr>
           <w:ilvl w:val="0"/>
-          <w:numId w:val="1061"/>
+          <w:numId w:val="1063"/>
         </w:numPr>
       </w:pPr>
       <w:r>
@@ -3150,13 +3176,13 @@
         <w:pStyle w:val="FirstParagraph"/>
       </w:pPr>
       <w:r>
-        <w:t xml:space="preserve">This cannot be decided from the present data. Sections 3.3 and 4.2 now say so and refer to</w:t>
-      </w:r>
-      <w:r>
-        <w:t xml:space="preserve"> </w:t>
-      </w:r>
-      <w:r>
-        <w:t xml:space="preserve">“an ordered D0₃ phase of unknown spatial scale”</w:t>
+        <w:t xml:space="preserve">This cannot be decided from the present data. Sections 3.3 and 4.1 now say so and refer to an ordered D0₃ phase</w:t>
+      </w:r>
+      <w:r>
+        <w:t xml:space="preserve"> </w:t>
+      </w:r>
+      <w:r>
+        <w:t xml:space="preserve">“of unknown spatial scale”</w:t>
       </w:r>
       <w:r>
         <w:t xml:space="preserve">.</w:t>
@@ -3167,7 +3193,7 @@
         <w:pStyle w:val="Compact"/>
         <w:numPr>
           <w:ilvl w:val="0"/>
-          <w:numId w:val="1062"/>
+          <w:numId w:val="1064"/>
         </w:numPr>
       </w:pPr>
       <w:r>
@@ -3191,7 +3217,7 @@
         <w:pStyle w:val="FirstParagraph"/>
       </w:pPr>
       <w:r>
-        <w:t xml:space="preserve">Done. That sentence has been removed. Section 4.1 now states only that there is no evidence the D0₃ raises the resistance to plastic flow in the way B2 does in the benchmark, and places B2 among several factors that bear on reversibility.</w:t>
+        <w:t xml:space="preserve">Done. That sentence has been removed. Section 4.1 now states only that there is no evidence that the D0₃ raises the resistance to plastic flow in the way B2 does in the Omori alloy, and places B2 among several factors that bear on reversibility.</w:t>
       </w:r>
     </w:p>
     <w:bookmarkEnd w:id="27"/>
@@ -3209,7 +3235,7 @@
         <w:pStyle w:val="Compact"/>
         <w:numPr>
           <w:ilvl w:val="0"/>
-          <w:numId w:val="1063"/>
+          <w:numId w:val="1065"/>
         </w:numPr>
       </w:pPr>
       <w:r>
@@ -3245,24 +3271,24 @@
         <w:pStyle w:val="FirstParagraph"/>
       </w:pPr>
       <w:r>
-        <w:t xml:space="preserve">Done. The diffraction results are described throughout as the state</w:t>
-      </w:r>
-      <w:r>
-        <w:t xml:space="preserve"> </w:t>
-      </w:r>
-      <w:r>
-        <w:t xml:space="preserve">“as quenched from 1200 °C”</w:t>
-      </w:r>
-      <w:r>
-        <w:t xml:space="preserve">. Section 4.1 discusses explicitly whether the γ formed at temperature or on cooling, and leaves this open.</w:t>
-      </w:r>
-    </w:p>
-    <w:p>
-      <w:pPr>
-        <w:pStyle w:val="Compact"/>
-        <w:numPr>
-          <w:ilvl w:val="0"/>
-          <w:numId w:val="1064"/>
+        <w:t xml:space="preserve">Done. Section 3.3 now says that the dual-phase constitution</w:t>
+      </w:r>
+      <w:r>
+        <w:t xml:space="preserve"> </w:t>
+      </w:r>
+      <w:r>
+        <w:t xml:space="preserve">“is retained at room temperature after that treatment …; whether it is also the constitution at 1200 °C cannot be established from room-temperature diffraction”</w:t>
+      </w:r>
+      <w:r>
+        <w:t xml:space="preserve">. Section 4.1 discusses whether the γ formed at temperature or on cooling, and leaves this open.</w:t>
+      </w:r>
+    </w:p>
+    <w:p>
+      <w:pPr>
+        <w:pStyle w:val="Compact"/>
+        <w:numPr>
+          <w:ilvl w:val="0"/>
+          <w:numId w:val="1066"/>
         </w:numPr>
       </w:pPr>
       <w:r>
@@ -3274,7 +3300,7 @@
         <w:pStyle w:val="FirstParagraph"/>
       </w:pPr>
       <w:r>
-        <w:t xml:space="preserve">Done. Section 4.3 now states that microstructures were examined only after the 1200 °C anneals, so the regimes are</w:t>
+        <w:t xml:space="preserve">Done. Section 4.2 now states that microstructures were examined only after the 1200 °C anneals, so the regimes are</w:t>
       </w:r>
       <w:r>
         <w:t xml:space="preserve"> </w:t>
@@ -3283,15 +3309,15 @@
         <w:t xml:space="preserve">“interpretations of the mechanical trends rather than observed microstructural stages”</w:t>
       </w:r>
       <w:r>
-        <w:t xml:space="preserve">, and the individual statements are worded as interpretations.</w:t>
-      </w:r>
-    </w:p>
-    <w:p>
-      <w:pPr>
-        <w:pStyle w:val="Compact"/>
-        <w:numPr>
-          <w:ilvl w:val="0"/>
-          <w:numId w:val="1065"/>
+        <w:t xml:space="preserve">, and each statement is worded as an interpretation.</w:t>
+      </w:r>
+    </w:p>
+    <w:p>
+      <w:pPr>
+        <w:pStyle w:val="Compact"/>
+        <w:numPr>
+          <w:ilvl w:val="0"/>
+          <w:numId w:val="1067"/>
         </w:numPr>
       </w:pPr>
       <w:r>
@@ -3303,15 +3329,15 @@
         <w:pStyle w:val="FirstParagraph"/>
       </w:pPr>
       <w:r>
-        <w:t xml:space="preserve">Done. Section 4.3 now notes that the decrease (33.0 → 25.6%) exceeds the specimen scatter (one standard deviation ≤1.2%), and that its cause is not identified. Coarsening, surface oxidation or decarburization, quench effects and changes in phase fractions are all possible, and none was measured across the series.</w:t>
-      </w:r>
-    </w:p>
-    <w:p>
-      <w:pPr>
-        <w:pStyle w:val="Compact"/>
-        <w:numPr>
-          <w:ilvl w:val="0"/>
-          <w:numId w:val="1066"/>
+        <w:t xml:space="preserve">Done. Section 4.2 now notes that the decrease (33.0 → 25.6%) exceeds the specimen scatter (one standard deviation ≤1.2%), and that its cause is not identified: coarsening, surface oxidation or decarburization, quench effects and changes in phase fractions are all possible, and none was measured across the series.</w:t>
+      </w:r>
+    </w:p>
+    <w:p>
+      <w:pPr>
+        <w:pStyle w:val="Compact"/>
+        <w:numPr>
+          <w:ilvl w:val="0"/>
+          <w:numId w:val="1068"/>
         </w:numPr>
       </w:pPr>
       <w:r>
@@ -3323,7 +3349,7 @@
         <w:pStyle w:val="FirstParagraph"/>
       </w:pPr>
       <w:r>
-        <w:t xml:space="preserve">Done. The phrase has been removed. Section 4.3 now states that in this duplex wire, phase fractions, ordering and texture may also change across the series and the effect of prior cold work is not separated, so grain size need not be the only variable.</w:t>
+        <w:t xml:space="preserve">Done. The phrase has been removed. Section 4.2 now states that in this dual-phase wire the phase fractions, ordering and texture may also change across the series and the effect of prior cold work is not separated, so grain size need not be the only variable.</w:t>
       </w:r>
     </w:p>
     <w:bookmarkEnd w:id="28"/>
@@ -3341,7 +3367,7 @@
         <w:pStyle w:val="Compact"/>
         <w:numPr>
           <w:ilvl w:val="0"/>
-          <w:numId w:val="1067"/>
+          <w:numId w:val="1069"/>
         </w:numPr>
       </w:pPr>
       <w:r>
@@ -3353,15 +3379,15 @@
         <w:pStyle w:val="FirstParagraph"/>
       </w:pPr>
       <w:r>
-        <w:t xml:space="preserve">Done (now Section 4.4). The section opens by stating the workflow as it was run: the request, the six ranked families, the choice of one, a composition outside its range, and no phase-stability calculation between report and melt. A new paragraph then follows the failure chain link by link.</w:t>
-      </w:r>
-    </w:p>
-    <w:p>
-      <w:pPr>
-        <w:pStyle w:val="Compact"/>
-        <w:numPr>
-          <w:ilvl w:val="0"/>
-          <w:numId w:val="1068"/>
+        <w:t xml:space="preserve">Done. Section 4.3 now opens by stating the workflow as it was run: the request, the six ranked families, the choice of one, a composition outside its range, and no phase-stability calculation between report and melt. The next paragraph follows the failure chain link by link.</w:t>
+      </w:r>
+    </w:p>
+    <w:p>
+      <w:pPr>
+        <w:pStyle w:val="Compact"/>
+        <w:numPr>
+          <w:ilvl w:val="0"/>
+          <w:numId w:val="1070"/>
         </w:numPr>
       </w:pPr>
       <w:r>
@@ -3373,15 +3399,15 @@
         <w:pStyle w:val="FirstParagraph"/>
       </w:pPr>
       <w:r>
-        <w:t xml:space="preserve">The same paragraph answers this directly.</w:t>
-      </w:r>
-    </w:p>
-    <w:p>
-      <w:pPr>
-        <w:pStyle w:val="Compact"/>
-        <w:numPr>
-          <w:ilvl w:val="0"/>
-          <w:numId w:val="1069"/>
+        <w:t xml:space="preserve">The same paragraph answers this directly, using the calculations of Section 3.4:</w:t>
+      </w:r>
+    </w:p>
+    <w:p>
+      <w:pPr>
+        <w:pStyle w:val="Compact"/>
+        <w:numPr>
+          <w:ilvl w:val="0"/>
+          <w:numId w:val="1071"/>
         </w:numPr>
       </w:pPr>
       <w:r>
@@ -3395,15 +3421,15 @@
         <w:t xml:space="preserve"> </w:t>
       </w:r>
       <w:r>
-        <w:t xml:space="preserve">The carbon-bearing compositions sampled inside the agent’s own window cannot, on calculation, be solution-treated to single-phase α at 1200 °C, so the obstacle is not peculiar to the composition melted. This link is attributable to the model.</w:t>
-      </w:r>
-    </w:p>
-    <w:p>
-      <w:pPr>
-        <w:pStyle w:val="Compact"/>
-        <w:numPr>
-          <w:ilvl w:val="0"/>
-          <w:numId w:val="1069"/>
+        <w:t xml:space="preserve">The carbon-bearing compositions sampled inside the agent’s own range cannot, on calculation, be solution-treated to single-phase α at 1200 °C, so the obstacle is not peculiar to the composition melted. This link is attributable to the model.</w:t>
+      </w:r>
+    </w:p>
+    <w:p>
+      <w:pPr>
+        <w:pStyle w:val="Compact"/>
+        <w:numPr>
+          <w:ilvl w:val="0"/>
+          <w:numId w:val="1071"/>
         </w:numPr>
       </w:pPr>
       <w:r>
@@ -3417,15 +3443,15 @@
         <w:t xml:space="preserve"> </w:t>
       </w:r>
       <w:r>
-        <w:t xml:space="preserve">The melt lies outside the window in Mn and Al. That deviation moves the alloy in the observed direction but, on calculation, does not decide the outcome.</w:t>
-      </w:r>
-    </w:p>
-    <w:p>
-      <w:pPr>
-        <w:pStyle w:val="Compact"/>
-        <w:numPr>
-          <w:ilvl w:val="0"/>
-          <w:numId w:val="1069"/>
+        <w:t xml:space="preserve">The melt lies outside the range in Mn and Al. That deviation moves the alloy in the observed direction but, on calculation, does not decide the outcome.</w:t>
+      </w:r>
+    </w:p>
+    <w:p>
+      <w:pPr>
+        <w:pStyle w:val="Compact"/>
+        <w:numPr>
+          <w:ilvl w:val="0"/>
+          <w:numId w:val="1071"/>
         </w:numPr>
       </w:pPr>
       <w:r>
@@ -3439,15 +3465,15 @@
         <w:t xml:space="preserve"> </w:t>
       </w:r>
       <w:r>
-        <w:t xml:space="preserve">Half the silicon was lost, but the nominal composition does not reach single-phase α either.</w:t>
-      </w:r>
-    </w:p>
-    <w:p>
-      <w:pPr>
-        <w:pStyle w:val="Compact"/>
-        <w:numPr>
-          <w:ilvl w:val="0"/>
-          <w:numId w:val="1069"/>
+        <w:t xml:space="preserve">Half the silicon was lost, but at its measured level silicon does not obstruct the α field once carbon is removed; whether the intended silicon would have opened it with carbon present is not answered by the calculations.</w:t>
+      </w:r>
+    </w:p>
+    <w:p>
+      <w:pPr>
+        <w:pStyle w:val="Compact"/>
+        <w:numPr>
+          <w:ilvl w:val="0"/>
+          <w:numId w:val="1071"/>
         </w:numPr>
       </w:pPr>
       <w:r>
@@ -3469,15 +3495,15 @@
         <w:pStyle w:val="FirstParagraph"/>
       </w:pPr>
       <w:r>
-        <w:t xml:space="preserve">The omitted screening calculation is attributed to the workflow, not to the model, which recommended it.</w:t>
-      </w:r>
-    </w:p>
-    <w:p>
-      <w:pPr>
-        <w:pStyle w:val="Compact"/>
-        <w:numPr>
-          <w:ilvl w:val="0"/>
-          <w:numId w:val="1070"/>
+        <w:t xml:space="preserve">The omitted screening calculation is attributed to the workflow, not to the model, whose report recommended it.</w:t>
+      </w:r>
+    </w:p>
+    <w:p>
+      <w:pPr>
+        <w:pStyle w:val="Compact"/>
+        <w:numPr>
+          <w:ilvl w:val="0"/>
+          <w:numId w:val="1072"/>
         </w:numPr>
       </w:pPr>
       <w:r>
@@ -3489,47 +3515,71 @@
         <w:pStyle w:val="FirstParagraph"/>
       </w:pPr>
       <w:r>
-        <w:t xml:space="preserve">Done. A new paragraph in Section 4.4 compares the workflow with four kinds of approach:</w:t>
-      </w:r>
-      <w:r>
-        <w:t xml:space="preserve"> </w:t>
-      </w:r>
-      <w:r>
-        <w:t xml:space="preserve">- domain-trained language models with explicit datasets and quantitative test errors (AlloyBERT; AlloyGPT, trained on CALPHAD-generated records);</w:t>
-      </w:r>
-      <w:r>
-        <w:t xml:space="preserve"> </w:t>
-      </w:r>
-      <w:r>
-        <w:t xml:space="preserve">- LLM agents that call physics tools (AtomAgents, atomistic simulation; an agentic system using Thermo-Calc calculations);</w:t>
-      </w:r>
-      <w:r>
-        <w:t xml:space="preserve"> </w:t>
-      </w:r>
-      <w:r>
-        <w:t xml:space="preserve">- adaptive and active-learning loops closed on experiment (Xue et al., NiTi-based SMAs, 36 compositions over nine loops; Rao et al., high-entropy Invar alloys);</w:t>
-      </w:r>
-      <w:r>
-        <w:t xml:space="preserve"> </w:t>
-      </w:r>
-      <w:r>
-        <w:t xml:space="preserve">- data-driven SMA selection confirmed experimentally (the AIMS framework).</w:t>
-      </w:r>
-    </w:p>
-    <w:p>
-      <w:pPr>
-        <w:pStyle w:val="BodyText"/>
-      </w:pPr>
-      <w:r>
-        <w:t xml:space="preserve">In those workflows a calculation or an experiment stands between the proposal and the decision to pursue it. The single-shot, tool-free workflow tested here had no such step. Seven references have been added or cited.</w:t>
-      </w:r>
-    </w:p>
-    <w:p>
-      <w:pPr>
-        <w:pStyle w:val="Compact"/>
-        <w:numPr>
-          <w:ilvl w:val="0"/>
-          <w:numId w:val="1071"/>
+        <w:t xml:space="preserve">Done. A new paragraph in Section 4.3 compares the workflow with four kinds of approach:</w:t>
+      </w:r>
+    </w:p>
+    <w:p>
+      <w:pPr>
+        <w:pStyle w:val="Compact"/>
+        <w:numPr>
+          <w:ilvl w:val="0"/>
+          <w:numId w:val="1073"/>
+        </w:numPr>
+      </w:pPr>
+      <w:r>
+        <w:t xml:space="preserve">domain-trained language models with explicit datasets and quantitative test errors (AlloyBERT; AlloyGPT, trained on CALPHAD-generated records);</w:t>
+      </w:r>
+    </w:p>
+    <w:p>
+      <w:pPr>
+        <w:pStyle w:val="Compact"/>
+        <w:numPr>
+          <w:ilvl w:val="0"/>
+          <w:numId w:val="1073"/>
+        </w:numPr>
+      </w:pPr>
+      <w:r>
+        <w:t xml:space="preserve">LLM agents that call physics tools (AtomAgents, atomistic simulation; an agentic system using Thermo-Calc calculations);</w:t>
+      </w:r>
+    </w:p>
+    <w:p>
+      <w:pPr>
+        <w:pStyle w:val="Compact"/>
+        <w:numPr>
+          <w:ilvl w:val="0"/>
+          <w:numId w:val="1073"/>
+        </w:numPr>
+      </w:pPr>
+      <w:r>
+        <w:t xml:space="preserve">adaptive and active-learning loops closed on experiment (Xue et al., NiTi-based SMAs, 36 compositions over nine loops; Rao et al., high-entropy Invar alloys);</w:t>
+      </w:r>
+    </w:p>
+    <w:p>
+      <w:pPr>
+        <w:pStyle w:val="Compact"/>
+        <w:numPr>
+          <w:ilvl w:val="0"/>
+          <w:numId w:val="1073"/>
+        </w:numPr>
+      </w:pPr>
+      <w:r>
+        <w:t xml:space="preserve">data-driven SMA selection confirmed experimentally (the AIMS framework).</w:t>
+      </w:r>
+    </w:p>
+    <w:p>
+      <w:pPr>
+        <w:pStyle w:val="FirstParagraph"/>
+      </w:pPr>
+      <w:r>
+        <w:t xml:space="preserve">In those workflows a calculation or an experiment stands between the proposal and the decision to pursue it. The single-shot, tool-free workflow tested here had no such step. Six references have been added.</w:t>
+      </w:r>
+    </w:p>
+    <w:p>
+      <w:pPr>
+        <w:pStyle w:val="Compact"/>
+        <w:numPr>
+          <w:ilvl w:val="0"/>
+          <w:numId w:val="1074"/>
         </w:numPr>
       </w:pPr>
       <w:r>
@@ -3541,16 +3591,16 @@
         <w:pStyle w:val="FirstParagraph"/>
       </w:pPr>
       <w:r>
-        <w:t xml:space="preserve">Done. The measured conclusions are confined to</w:t>
-      </w:r>
-      <w:r>
-        <w:t xml:space="preserve"> </w:t>
-      </w:r>
-      <w:r>
-        <w:t xml:space="preserve">“the conditions reported”</w:t>
-      </w:r>
-      <w:r>
-        <w:t xml:space="preserve">. Section 4.1 states that</w:t>
+        <w:t xml:space="preserve">Done. The Conclusions state that the experimental conclusions</w:t>
+      </w:r>
+      <w:r>
+        <w:t xml:space="preserve"> </w:t>
+      </w:r>
+      <w:r>
+        <w:t xml:space="preserve">“are confined to the conditions reported and remain valid if another processing route is later found to produce superelasticity in this composition”</w:t>
+      </w:r>
+      <w:r>
+        <w:t xml:space="preserve">, and Section 4.1 that</w:t>
       </w:r>
       <w:r>
         <w:t xml:space="preserve"> </w:t>
@@ -4283,6 +4333,9 @@
     <w:abstractNumId w:val="991"/>
   </w:num>
   <w:num w:numId="1003">
+    <w:abstractNumId w:val="991"/>
+  </w:num>
+  <w:num w:numId="1004">
     <w:abstractNumId w:val="99731"/>
     <w:lvlOverride w:ilvl="0">
       <w:startOverride w:val="1"/>
@@ -4312,7 +4365,7 @@
       <w:startOverride w:val="1"/>
     </w:lvlOverride>
   </w:num>
-  <w:num w:numId="1004">
+  <w:num w:numId="1005">
     <w:abstractNumId w:val="99732"/>
     <w:lvlOverride w:ilvl="0">
       <w:startOverride w:val="2"/>
@@ -4342,7 +4395,7 @@
       <w:startOverride w:val="2"/>
     </w:lvlOverride>
   </w:num>
-  <w:num w:numId="1005">
+  <w:num w:numId="1006">
     <w:abstractNumId w:val="99731"/>
     <w:lvlOverride w:ilvl="0">
       <w:startOverride w:val="1"/>
@@ -4372,7 +4425,7 @@
       <w:startOverride w:val="1"/>
     </w:lvlOverride>
   </w:num>
-  <w:num w:numId="1006">
+  <w:num w:numId="1007">
     <w:abstractNumId w:val="99732"/>
     <w:lvlOverride w:ilvl="0">
       <w:startOverride w:val="2"/>
@@ -4402,7 +4455,7 @@
       <w:startOverride w:val="2"/>
     </w:lvlOverride>
   </w:num>
-  <w:num w:numId="1007">
+  <w:num w:numId="1008">
     <w:abstractNumId w:val="99733"/>
     <w:lvlOverride w:ilvl="0">
       <w:startOverride w:val="3"/>
@@ -4432,7 +4485,7 @@
       <w:startOverride w:val="3"/>
     </w:lvlOverride>
   </w:num>
-  <w:num w:numId="1008">
+  <w:num w:numId="1009">
     <w:abstractNumId w:val="99734"/>
     <w:lvlOverride w:ilvl="0">
       <w:startOverride w:val="4"/>
@@ -4462,7 +4515,7 @@
       <w:startOverride w:val="4"/>
     </w:lvlOverride>
   </w:num>
-  <w:num w:numId="1009">
+  <w:num w:numId="1010">
     <w:abstractNumId w:val="99731"/>
     <w:lvlOverride w:ilvl="0">
       <w:startOverride w:val="1"/>
@@ -4492,7 +4545,7 @@
       <w:startOverride w:val="1"/>
     </w:lvlOverride>
   </w:num>
-  <w:num w:numId="1010">
+  <w:num w:numId="1011">
     <w:abstractNumId w:val="99732"/>
     <w:lvlOverride w:ilvl="0">
       <w:startOverride w:val="2"/>
@@ -4522,7 +4575,7 @@
       <w:startOverride w:val="2"/>
     </w:lvlOverride>
   </w:num>
-  <w:num w:numId="1011">
+  <w:num w:numId="1012">
     <w:abstractNumId w:val="99733"/>
     <w:lvlOverride w:ilvl="0">
       <w:startOverride w:val="3"/>
@@ -4552,7 +4605,7 @@
       <w:startOverride w:val="3"/>
     </w:lvlOverride>
   </w:num>
-  <w:num w:numId="1012">
+  <w:num w:numId="1013">
     <w:abstractNumId w:val="99734"/>
     <w:lvlOverride w:ilvl="0">
       <w:startOverride w:val="4"/>
@@ -4582,7 +4635,7 @@
       <w:startOverride w:val="4"/>
     </w:lvlOverride>
   </w:num>
-  <w:num w:numId="1013">
+  <w:num w:numId="1014">
     <w:abstractNumId w:val="99731"/>
     <w:lvlOverride w:ilvl="0">
       <w:startOverride w:val="1"/>
@@ -4612,7 +4665,7 @@
       <w:startOverride w:val="1"/>
     </w:lvlOverride>
   </w:num>
-  <w:num w:numId="1014">
+  <w:num w:numId="1015">
     <w:abstractNumId w:val="99732"/>
     <w:lvlOverride w:ilvl="0">
       <w:startOverride w:val="2"/>
@@ -4642,7 +4695,7 @@
       <w:startOverride w:val="2"/>
     </w:lvlOverride>
   </w:num>
-  <w:num w:numId="1015">
+  <w:num w:numId="1016">
     <w:abstractNumId w:val="99733"/>
     <w:lvlOverride w:ilvl="0">
       <w:startOverride w:val="3"/>
@@ -4672,7 +4725,7 @@
       <w:startOverride w:val="3"/>
     </w:lvlOverride>
   </w:num>
-  <w:num w:numId="1016">
+  <w:num w:numId="1017">
     <w:abstractNumId w:val="99734"/>
     <w:lvlOverride w:ilvl="0">
       <w:startOverride w:val="4"/>
@@ -4702,7 +4755,7 @@
       <w:startOverride w:val="4"/>
     </w:lvlOverride>
   </w:num>
-  <w:num w:numId="1017">
+  <w:num w:numId="1018">
     <w:abstractNumId w:val="99731"/>
     <w:lvlOverride w:ilvl="0">
       <w:startOverride w:val="1"/>
@@ -4732,7 +4785,7 @@
       <w:startOverride w:val="1"/>
     </w:lvlOverride>
   </w:num>
-  <w:num w:numId="1018">
+  <w:num w:numId="1019">
     <w:abstractNumId w:val="99732"/>
     <w:lvlOverride w:ilvl="0">
       <w:startOverride w:val="2"/>
@@ -4762,7 +4815,7 @@
       <w:startOverride w:val="2"/>
     </w:lvlOverride>
   </w:num>
-  <w:num w:numId="1019">
+  <w:num w:numId="1020">
     <w:abstractNumId w:val="99733"/>
     <w:lvlOverride w:ilvl="0">
       <w:startOverride w:val="3"/>
@@ -4792,7 +4845,7 @@
       <w:startOverride w:val="3"/>
     </w:lvlOverride>
   </w:num>
-  <w:num w:numId="1020">
+  <w:num w:numId="1021">
     <w:abstractNumId w:val="99734"/>
     <w:lvlOverride w:ilvl="0">
       <w:startOverride w:val="4"/>
@@ -4822,7 +4875,7 @@
       <w:startOverride w:val="4"/>
     </w:lvlOverride>
   </w:num>
-  <w:num w:numId="1021">
+  <w:num w:numId="1022">
     <w:abstractNumId w:val="99731"/>
     <w:lvlOverride w:ilvl="0">
       <w:startOverride w:val="1"/>
@@ -4852,7 +4905,7 @@
       <w:startOverride w:val="1"/>
     </w:lvlOverride>
   </w:num>
-  <w:num w:numId="1022">
+  <w:num w:numId="1023">
     <w:abstractNumId w:val="99732"/>
     <w:lvlOverride w:ilvl="0">
       <w:startOverride w:val="2"/>
@@ -4882,7 +4935,7 @@
       <w:startOverride w:val="2"/>
     </w:lvlOverride>
   </w:num>
-  <w:num w:numId="1023">
+  <w:num w:numId="1024">
     <w:abstractNumId w:val="99733"/>
     <w:lvlOverride w:ilvl="0">
       <w:startOverride w:val="3"/>
@@ -4912,7 +4965,7 @@
       <w:startOverride w:val="3"/>
     </w:lvlOverride>
   </w:num>
-  <w:num w:numId="1024">
+  <w:num w:numId="1025">
     <w:abstractNumId w:val="99734"/>
     <w:lvlOverride w:ilvl="0">
       <w:startOverride w:val="4"/>
@@ -4942,7 +4995,7 @@
       <w:startOverride w:val="4"/>
     </w:lvlOverride>
   </w:num>
-  <w:num w:numId="1025">
+  <w:num w:numId="1026">
     <w:abstractNumId w:val="99731"/>
     <w:lvlOverride w:ilvl="0">
       <w:startOverride w:val="1"/>
@@ -4972,7 +5025,7 @@
       <w:startOverride w:val="1"/>
     </w:lvlOverride>
   </w:num>
-  <w:num w:numId="1026">
+  <w:num w:numId="1027">
     <w:abstractNumId w:val="99732"/>
     <w:lvlOverride w:ilvl="0">
       <w:startOverride w:val="2"/>
@@ -5002,7 +5055,7 @@
       <w:startOverride w:val="2"/>
     </w:lvlOverride>
   </w:num>
-  <w:num w:numId="1027">
+  <w:num w:numId="1028">
     <w:abstractNumId w:val="99733"/>
     <w:lvlOverride w:ilvl="0">
       <w:startOverride w:val="3"/>
@@ -5032,7 +5085,7 @@
       <w:startOverride w:val="3"/>
     </w:lvlOverride>
   </w:num>
-  <w:num w:numId="1028">
+  <w:num w:numId="1029">
     <w:abstractNumId w:val="99734"/>
     <w:lvlOverride w:ilvl="0">
       <w:startOverride w:val="4"/>
@@ -5062,7 +5115,7 @@
       <w:startOverride w:val="4"/>
     </w:lvlOverride>
   </w:num>
-  <w:num w:numId="1029">
+  <w:num w:numId="1030">
     <w:abstractNumId w:val="99731"/>
     <w:lvlOverride w:ilvl="0">
       <w:startOverride w:val="1"/>
@@ -5092,7 +5145,7 @@
       <w:startOverride w:val="1"/>
     </w:lvlOverride>
   </w:num>
-  <w:num w:numId="1030">
+  <w:num w:numId="1031">
     <w:abstractNumId w:val="99732"/>
     <w:lvlOverride w:ilvl="0">
       <w:startOverride w:val="2"/>
@@ -5122,7 +5175,7 @@
       <w:startOverride w:val="2"/>
     </w:lvlOverride>
   </w:num>
-  <w:num w:numId="1031">
+  <w:num w:numId="1032">
     <w:abstractNumId w:val="99733"/>
     <w:lvlOverride w:ilvl="0">
       <w:startOverride w:val="3"/>
@@ -5152,7 +5205,7 @@
       <w:startOverride w:val="3"/>
     </w:lvlOverride>
   </w:num>
-  <w:num w:numId="1032">
+  <w:num w:numId="1033">
     <w:abstractNumId w:val="99731"/>
     <w:lvlOverride w:ilvl="0">
       <w:startOverride w:val="1"/>
@@ -5182,7 +5235,7 @@
       <w:startOverride w:val="1"/>
     </w:lvlOverride>
   </w:num>
-  <w:num w:numId="1033">
+  <w:num w:numId="1034">
     <w:abstractNumId w:val="99732"/>
     <w:lvlOverride w:ilvl="0">
       <w:startOverride w:val="2"/>
@@ -5212,7 +5265,7 @@
       <w:startOverride w:val="2"/>
     </w:lvlOverride>
   </w:num>
-  <w:num w:numId="1034">
+  <w:num w:numId="1035">
     <w:abstractNumId w:val="99733"/>
     <w:lvlOverride w:ilvl="0">
       <w:startOverride w:val="3"/>
@@ -5242,7 +5295,7 @@
       <w:startOverride w:val="3"/>
     </w:lvlOverride>
   </w:num>
-  <w:num w:numId="1035">
+  <w:num w:numId="1036">
     <w:abstractNumId w:val="99734"/>
     <w:lvlOverride w:ilvl="0">
       <w:startOverride w:val="4"/>
@@ -5272,7 +5325,7 @@
       <w:startOverride w:val="4"/>
     </w:lvlOverride>
   </w:num>
-  <w:num w:numId="1036">
+  <w:num w:numId="1037">
     <w:abstractNumId w:val="99731"/>
     <w:lvlOverride w:ilvl="0">
       <w:startOverride w:val="1"/>
@@ -5302,7 +5355,7 @@
       <w:startOverride w:val="1"/>
     </w:lvlOverride>
   </w:num>
-  <w:num w:numId="1037">
+  <w:num w:numId="1038">
     <w:abstractNumId w:val="99732"/>
     <w:lvlOverride w:ilvl="0">
       <w:startOverride w:val="2"/>
@@ -5332,7 +5385,7 @@
       <w:startOverride w:val="2"/>
     </w:lvlOverride>
   </w:num>
-  <w:num w:numId="1038">
+  <w:num w:numId="1039">
     <w:abstractNumId w:val="99733"/>
     <w:lvlOverride w:ilvl="0">
       <w:startOverride w:val="3"/>
@@ -5362,7 +5415,7 @@
       <w:startOverride w:val="3"/>
     </w:lvlOverride>
   </w:num>
-  <w:num w:numId="1039">
+  <w:num w:numId="1040">
     <w:abstractNumId w:val="99731"/>
     <w:lvlOverride w:ilvl="0">
       <w:startOverride w:val="1"/>
@@ -5392,7 +5445,7 @@
       <w:startOverride w:val="1"/>
     </w:lvlOverride>
   </w:num>
-  <w:num w:numId="1040">
+  <w:num w:numId="1041">
     <w:abstractNumId w:val="99732"/>
     <w:lvlOverride w:ilvl="0">
       <w:startOverride w:val="2"/>
@@ -5422,7 +5475,7 @@
       <w:startOverride w:val="2"/>
     </w:lvlOverride>
   </w:num>
-  <w:num w:numId="1041">
+  <w:num w:numId="1042">
     <w:abstractNumId w:val="99733"/>
     <w:lvlOverride w:ilvl="0">
       <w:startOverride w:val="3"/>
@@ -5452,7 +5505,7 @@
       <w:startOverride w:val="3"/>
     </w:lvlOverride>
   </w:num>
-  <w:num w:numId="1042">
+  <w:num w:numId="1043">
     <w:abstractNumId w:val="99734"/>
     <w:lvlOverride w:ilvl="0">
       <w:startOverride w:val="4"/>
@@ -5482,7 +5535,7 @@
       <w:startOverride w:val="4"/>
     </w:lvlOverride>
   </w:num>
-  <w:num w:numId="1043">
+  <w:num w:numId="1044">
     <w:abstractNumId w:val="99731"/>
     <w:lvlOverride w:ilvl="0">
       <w:startOverride w:val="1"/>
@@ -5512,7 +5565,7 @@
       <w:startOverride w:val="1"/>
     </w:lvlOverride>
   </w:num>
-  <w:num w:numId="1044">
+  <w:num w:numId="1045">
     <w:abstractNumId w:val="99732"/>
     <w:lvlOverride w:ilvl="0">
       <w:startOverride w:val="2"/>
@@ -5542,7 +5595,7 @@
       <w:startOverride w:val="2"/>
     </w:lvlOverride>
   </w:num>
-  <w:num w:numId="1045">
+  <w:num w:numId="1046">
     <w:abstractNumId w:val="99733"/>
     <w:lvlOverride w:ilvl="0">
       <w:startOverride w:val="3"/>
@@ -5572,7 +5625,7 @@
       <w:startOverride w:val="3"/>
     </w:lvlOverride>
   </w:num>
-  <w:num w:numId="1046">
+  <w:num w:numId="1047">
     <w:abstractNumId w:val="99734"/>
     <w:lvlOverride w:ilvl="0">
       <w:startOverride w:val="4"/>
@@ -5602,7 +5655,7 @@
       <w:startOverride w:val="4"/>
     </w:lvlOverride>
   </w:num>
-  <w:num w:numId="1047">
+  <w:num w:numId="1048">
     <w:abstractNumId w:val="99731"/>
     <w:lvlOverride w:ilvl="0">
       <w:startOverride w:val="1"/>
@@ -5632,7 +5685,7 @@
       <w:startOverride w:val="1"/>
     </w:lvlOverride>
   </w:num>
-  <w:num w:numId="1048">
+  <w:num w:numId="1049">
     <w:abstractNumId w:val="99732"/>
     <w:lvlOverride w:ilvl="0">
       <w:startOverride w:val="2"/>
@@ -5662,7 +5715,7 @@
       <w:startOverride w:val="2"/>
     </w:lvlOverride>
   </w:num>
-  <w:num w:numId="1049">
+  <w:num w:numId="1050">
     <w:abstractNumId w:val="99733"/>
     <w:lvlOverride w:ilvl="0">
       <w:startOverride w:val="3"/>
@@ -5692,7 +5745,7 @@
       <w:startOverride w:val="3"/>
     </w:lvlOverride>
   </w:num>
-  <w:num w:numId="1050">
+  <w:num w:numId="1051">
     <w:abstractNumId w:val="99734"/>
     <w:lvlOverride w:ilvl="0">
       <w:startOverride w:val="4"/>
@@ -5722,7 +5775,7 @@
       <w:startOverride w:val="4"/>
     </w:lvlOverride>
   </w:num>
-  <w:num w:numId="1051">
+  <w:num w:numId="1052">
     <w:abstractNumId w:val="99731"/>
     <w:lvlOverride w:ilvl="0">
       <w:startOverride w:val="1"/>
@@ -5752,7 +5805,10 @@
       <w:startOverride w:val="1"/>
     </w:lvlOverride>
   </w:num>
-  <w:num w:numId="1052">
+  <w:num w:numId="1053">
+    <w:abstractNumId w:val="991"/>
+  </w:num>
+  <w:num w:numId="1054">
     <w:abstractNumId w:val="99732"/>
     <w:lvlOverride w:ilvl="0">
       <w:startOverride w:val="2"/>
@@ -5782,7 +5838,7 @@
       <w:startOverride w:val="2"/>
     </w:lvlOverride>
   </w:num>
-  <w:num w:numId="1053">
+  <w:num w:numId="1055">
     <w:abstractNumId w:val="99733"/>
     <w:lvlOverride w:ilvl="0">
       <w:startOverride w:val="3"/>
@@ -5812,7 +5868,7 @@
       <w:startOverride w:val="3"/>
     </w:lvlOverride>
   </w:num>
-  <w:num w:numId="1054">
+  <w:num w:numId="1056">
     <w:abstractNumId w:val="99734"/>
     <w:lvlOverride w:ilvl="0">
       <w:startOverride w:val="4"/>
@@ -5842,7 +5898,7 @@
       <w:startOverride w:val="4"/>
     </w:lvlOverride>
   </w:num>
-  <w:num w:numId="1055">
+  <w:num w:numId="1057">
     <w:abstractNumId w:val="99731"/>
     <w:lvlOverride w:ilvl="0">
       <w:startOverride w:val="1"/>
@@ -5872,7 +5928,7 @@
       <w:startOverride w:val="1"/>
     </w:lvlOverride>
   </w:num>
-  <w:num w:numId="1056">
+  <w:num w:numId="1058">
     <w:abstractNumId w:val="99732"/>
     <w:lvlOverride w:ilvl="0">
       <w:startOverride w:val="2"/>
@@ -5902,7 +5958,7 @@
       <w:startOverride w:val="2"/>
     </w:lvlOverride>
   </w:num>
-  <w:num w:numId="1057">
+  <w:num w:numId="1059">
     <w:abstractNumId w:val="99733"/>
     <w:lvlOverride w:ilvl="0">
       <w:startOverride w:val="3"/>
@@ -5932,7 +5988,7 @@
       <w:startOverride w:val="3"/>
     </w:lvlOverride>
   </w:num>
-  <w:num w:numId="1058">
+  <w:num w:numId="1060">
     <w:abstractNumId w:val="99734"/>
     <w:lvlOverride w:ilvl="0">
       <w:startOverride w:val="4"/>
@@ -5962,7 +6018,7 @@
       <w:startOverride w:val="4"/>
     </w:lvlOverride>
   </w:num>
-  <w:num w:numId="1059">
+  <w:num w:numId="1061">
     <w:abstractNumId w:val="99731"/>
     <w:lvlOverride w:ilvl="0">
       <w:startOverride w:val="1"/>
@@ -5992,7 +6048,7 @@
       <w:startOverride w:val="1"/>
     </w:lvlOverride>
   </w:num>
-  <w:num w:numId="1060">
+  <w:num w:numId="1062">
     <w:abstractNumId w:val="99732"/>
     <w:lvlOverride w:ilvl="0">
       <w:startOverride w:val="2"/>
@@ -6022,7 +6078,7 @@
       <w:startOverride w:val="2"/>
     </w:lvlOverride>
   </w:num>
-  <w:num w:numId="1061">
+  <w:num w:numId="1063">
     <w:abstractNumId w:val="99733"/>
     <w:lvlOverride w:ilvl="0">
       <w:startOverride w:val="3"/>
@@ -6052,7 +6108,7 @@
       <w:startOverride w:val="3"/>
     </w:lvlOverride>
   </w:num>
-  <w:num w:numId="1062">
+  <w:num w:numId="1064">
     <w:abstractNumId w:val="99734"/>
     <w:lvlOverride w:ilvl="0">
       <w:startOverride w:val="4"/>
@@ -6082,7 +6138,7 @@
       <w:startOverride w:val="4"/>
     </w:lvlOverride>
   </w:num>
-  <w:num w:numId="1063">
+  <w:num w:numId="1065">
     <w:abstractNumId w:val="99731"/>
     <w:lvlOverride w:ilvl="0">
       <w:startOverride w:val="1"/>
@@ -6112,7 +6168,7 @@
       <w:startOverride w:val="1"/>
     </w:lvlOverride>
   </w:num>
-  <w:num w:numId="1064">
+  <w:num w:numId="1066">
     <w:abstractNumId w:val="99732"/>
     <w:lvlOverride w:ilvl="0">
       <w:startOverride w:val="2"/>
@@ -6142,7 +6198,7 @@
       <w:startOverride w:val="2"/>
     </w:lvlOverride>
   </w:num>
-  <w:num w:numId="1065">
+  <w:num w:numId="1067">
     <w:abstractNumId w:val="99733"/>
     <w:lvlOverride w:ilvl="0">
       <w:startOverride w:val="3"/>
@@ -6172,7 +6228,7 @@
       <w:startOverride w:val="3"/>
     </w:lvlOverride>
   </w:num>
-  <w:num w:numId="1066">
+  <w:num w:numId="1068">
     <w:abstractNumId w:val="99734"/>
     <w:lvlOverride w:ilvl="0">
       <w:startOverride w:val="4"/>
@@ -6202,7 +6258,7 @@
       <w:startOverride w:val="4"/>
     </w:lvlOverride>
   </w:num>
-  <w:num w:numId="1067">
+  <w:num w:numId="1069">
     <w:abstractNumId w:val="99731"/>
     <w:lvlOverride w:ilvl="0">
       <w:startOverride w:val="1"/>
@@ -6232,7 +6288,7 @@
       <w:startOverride w:val="1"/>
     </w:lvlOverride>
   </w:num>
-  <w:num w:numId="1068">
+  <w:num w:numId="1070">
     <w:abstractNumId w:val="99732"/>
     <w:lvlOverride w:ilvl="0">
       <w:startOverride w:val="2"/>
@@ -6262,10 +6318,10 @@
       <w:startOverride w:val="2"/>
     </w:lvlOverride>
   </w:num>
-  <w:num w:numId="1069">
+  <w:num w:numId="1071">
     <w:abstractNumId w:val="991"/>
   </w:num>
-  <w:num w:numId="1070">
+  <w:num w:numId="1072">
     <w:abstractNumId w:val="99733"/>
     <w:lvlOverride w:ilvl="0">
       <w:startOverride w:val="3"/>
@@ -6295,7 +6351,10 @@
       <w:startOverride w:val="3"/>
     </w:lvlOverride>
   </w:num>
-  <w:num w:numId="1071">
+  <w:num w:numId="1073">
+    <w:abstractNumId w:val="991"/>
+  </w:num>
+  <w:num w:numId="1074">
     <w:abstractNumId w:val="99734"/>
     <w:lvlOverride w:ilvl="0">
       <w:startOverride w:val="4"/>

</xml_diff>

<commit_message>
JMEP R1: one Deep Research session, request not repeated (Frank, R2#3a/3b); rebuild
</commit_message>
<xml_diff>
--- a/submissions/JMEP-R1/Response-to-reviewers.docx
+++ b/submissions/JMEP-R1/Response-to-reviewers.docx
@@ -1268,7 +1268,7 @@
         <w:pStyle w:val="FirstParagraph"/>
       </w:pPr>
       <w:r>
-        <w:t xml:space="preserve">The report proposes six candidate families and ranks them (Online Resource 1, Section 8.2): Hypothesis B1, an Fe-Mn-Si-Cr-V-C alloy, first, and Hypotheses A1 and A2, both built on the Fe-Mn-Al-Ni system, tied for second. One composition was synthesized, from A2, and Section 2.1 now states the decision rule. We chose A2 because it builds on the Fe-Mn-Al-Ni system, on which there is a substantial body of earlier work: an alloy of established composition from that system, the Omori alloy, could be processed in parallel as a reference, and the results compared directly with the published record. Of the two joint-second hypotheses, A2 adds no chromium, keeps more nickel, and carries the report’s highest recoverable-strain target.</w:t>
+        <w:t xml:space="preserve">There was one Deep Research session, and the request was not repeated (Section 2.1; comment 3b). The report proposes six candidate families and ranks them (Online Resource 1, Section 8.2): Hypothesis B1, an Fe-Mn-Si-Cr-V-C alloy, first, and Hypotheses A1 and A2, both built on the Fe-Mn-Al-Ni system, tied for second. One composition was synthesized, from A2, and Section 2.1 now states the decision rule. We chose A2 because it builds on the Fe-Mn-Al-Ni system, on which there is a substantial body of earlier work: an alloy of established composition from that system, the Omori alloy, could be processed in parallel as a reference, and the results compared directly with the published record. Of the two joint-second hypotheses, A2 adds no chromium, keeps more nickel, and carries the report’s highest recoverable-strain target.</w:t>
       </w:r>
     </w:p>
     <w:p>
@@ -1308,17 +1308,7 @@
         <w:pStyle w:val="FirstParagraph"/>
       </w:pPr>
       <w:r>
-        <w:rPr>
-          <w:b/>
-          <w:bCs/>
-        </w:rPr>
-        <w:t xml:space="preserve">[OPEN — FC: confirm that there was one Deep Research session and that the request was not repeated.]</w:t>
-      </w:r>
-      <w:r>
-        <w:t xml:space="preserve"> </w:t>
-      </w:r>
-      <w:r>
-        <w:t xml:space="preserve">Section 4.3 now states that</w:t>
+        <w:t xml:space="preserve">The request was made in a single Deep Research session and was not repeated. Section 2.1 now says so explicitly, and Section 4.3 states that</w:t>
       </w:r>
       <w:r>
         <w:t xml:space="preserve"> </w:t>
@@ -1327,7 +1317,7 @@
         <w:t xml:space="preserve">“run-to-run variation in the agent’s output was not tested, so nothing here establishes a failure rate”</w:t>
       </w:r>
       <w:r>
-        <w:t xml:space="preserve">. If the request was not repeated, Section 2.1 will say so explicitly.</w:t>
+        <w:t xml:space="preserve">.</w:t>
       </w:r>
     </w:p>
     <w:p>

</xml_diff>

<commit_message>
JMEP R1: X. Wang added per Katona 10-15 (52497 withdrawn, author list adjusted by the office); letter Authors paragraph filled
</commit_message>
<xml_diff>
--- a/submissions/JMEP-R1/Response-to-reviewers.docx
+++ b/submissions/JMEP-R1/Response-to-reviewers.docx
@@ -572,11 +572,7 @@
         <w:t xml:space="preserve"> </w:t>
       </w:r>
       <w:r>
-        <w:rPr>
-          <w:b/>
-          <w:bCs/>
-        </w:rPr>
-        <w:t xml:space="preserve">[OPEN — FC: if X. Wang is added (he supervised the work throughout, per the Author contributions statement), state it here and attach the journal’s authorship-change form. The Katona draft asks what the journal needs.]</w:t>
+        <w:t xml:space="preserve">X. Wang (School of Engineering Technologies, Purdue University), who supervised the work, has been added as an author, giving the author list of JMEP-26-09-52497, now withdrawn: F.Y. Cai, S. Cai, X. Wang, J. Yan. The editorial office adjusted the author list on 15 October 2026, and each author’s written approval is being provided through the copyright transfer forms submitted with this revision, as the office requested. His contribution is stated in the Author contributions declaration.</w:t>
       </w:r>
     </w:p>
     <w:bookmarkEnd w:id="9"/>

</xml_diff>